<commit_message>
docs: actualiza capturas del Manual de Usuario tras la limpieza de UI
Retoma las 7 capturas que quedaron obsoletas por la limpieza de header
y la nueva sección de cuenta de usuario, y suma una sección "Mi cuenta"
con su propia captura. No se tocó el resto del texto ni la Memoria
Técnica (su única imagen, el DER, no se vio afectada por estos cambios).
</commit_message>
<xml_diff>
--- a/Laburin-Manual-de-Usuario.docx
+++ b/Laburin-Manual-de-Usuario.docx
@@ -1294,40 +1294,23 @@
         <w:spacing w:after="200" w:before="400"/>
       </w:pPr>
       <w:r>
-        <w:t xml:space="preserve">8. Recordatorios por inactividad</w:t>
-      </w:r>
-    </w:p>
-    <w:p>
-      <w:pPr>
-        <w:spacing w:after="160"/>
-      </w:pPr>
-      <w:r>
-        <w:t xml:space="preserve">Cuando una postulación lleva varios días sin ninguna novedad, sin que hayas registrado una interacción ni cambiado su estado, Laburin te lo marca con un recordatorio, para que no se te pase hacer un seguimiento.</w:t>
-      </w:r>
-    </w:p>
-    <w:p>
-      <w:pPr>
-        <w:spacing w:after="160"/>
-      </w:pPr>
-      <w:r>
-        <w:t xml:space="preserve">Vas a ver este aviso directamente en el Tablero, en la tarjeta de la postulación correspondiente (como se puede ver en la imagen de la sección anterior sobre el Tablero). Alcanza con registrar una interacción nueva o mover la tarjeta de estado para que el recordatorio se resuelva solo.</w:t>
-      </w:r>
-    </w:p>
-    <w:p>
-      <w:pPr>
-        <w:pStyle w:val="Heading1"/>
-        <w:spacing w:after="200" w:before="400"/>
-      </w:pPr>
-      <w:r>
-        <w:t xml:space="preserve">9. Panel de Métricas</w:t>
-      </w:r>
-    </w:p>
-    <w:p>
-      <w:pPr>
-        <w:spacing w:after="160"/>
-      </w:pPr>
-      <w:r>
-        <w:t xml:space="preserve">La sección "Analytics" te muestra un resumen de toda tu búsqueda laboral: cuántas postulaciones tenés activas, cómo se reparten entre las distintas etapas del proceso, cuál es tu puntaje de afinidad promedio, y qué fuentes te están trayendo mejores ofertas.</w:t>
+        <w:t xml:space="preserve">8. Mi cuenta</w:t>
+      </w:r>
+    </w:p>
+    <w:p>
+      <w:pPr>
+        <w:spacing w:after="160"/>
+      </w:pPr>
+      <w:r>
+        <w:t xml:space="preserve">Además de la configuración del motor de scoring, tenés una sección aparte para los datos de tu propia cuenta: tu nombre, tu contraseña y el tema de la aplicación.</w:t>
+      </w:r>
+    </w:p>
+    <w:p>
+      <w:pPr>
+        <w:spacing w:after="160"/>
+      </w:pPr>
+      <w:r>
+        <w:t xml:space="preserve">Para acceder, tocá "Mi cuenta" en el menú lateral, arriba de "Cerrar Sesión".</w:t>
       </w:r>
     </w:p>
     <w:p>
@@ -1361,6 +1344,176 @@
                   </pic:nvPicPr>
                   <pic:blipFill>
                     <a:blip r:embed="rId16" cstate="none"/>
+                    <a:srcRect/>
+                    <a:stretch>
+                      <a:fillRect/>
+                    </a:stretch>
+                  </pic:blipFill>
+                  <pic:spPr bwMode="auto">
+                    <a:xfrm>
+                      <a:off x="0" y="0"/>
+                      <a:ext cx="5715000" cy="3209925"/>
+                    </a:xfrm>
+                    <a:prstGeom prst="rect">
+                      <a:avLst/>
+                    </a:prstGeom>
+                  </pic:spPr>
+                </pic:pic>
+              </a:graphicData>
+            </a:graphic>
+          </wp:inline>
+        </w:drawing>
+      </w:r>
+    </w:p>
+    <w:p>
+      <w:pPr>
+        <w:spacing w:after="220"/>
+        <w:jc w:val="center"/>
+      </w:pPr>
+      <w:r>
+        <w:rPr>
+          <w:i/>
+          <w:iCs/>
+          <w:color w:val="555555"/>
+          <w:sz w:val="18"/>
+          <w:szCs w:val="18"/>
+        </w:rPr>
+        <w:t xml:space="preserve">Ventana de "Mi cuenta": nombre, email, cambio de contraseña y tema.</w:t>
+      </w:r>
+    </w:p>
+    <w:p>
+      <w:pPr>
+        <w:spacing w:after="160"/>
+      </w:pPr>
+      <w:r>
+        <w:t xml:space="preserve">Ahí podés:</w:t>
+      </w:r>
+    </w:p>
+    <w:p>
+      <w:pPr>
+        <w:pStyle w:val="ListParagraph"/>
+        <w:numPr>
+          <w:ilvl w:val="0"/>
+          <w:numId w:val="2"/>
+        </w:numPr>
+        <w:spacing w:after="80"/>
+      </w:pPr>
+      <w:r>
+        <w:t xml:space="preserve">Cambiar tu nombre para mostrar (se usa junto con tus iniciales, que aparecen como tu avatar).</w:t>
+      </w:r>
+    </w:p>
+    <w:p>
+      <w:pPr>
+        <w:pStyle w:val="ListParagraph"/>
+        <w:numPr>
+          <w:ilvl w:val="0"/>
+          <w:numId w:val="2"/>
+        </w:numPr>
+        <w:spacing w:after="80"/>
+      </w:pPr>
+      <w:r>
+        <w:t xml:space="preserve">Ver el email con el que te registraste (no se puede editar desde acá).</w:t>
+      </w:r>
+    </w:p>
+    <w:p>
+      <w:pPr>
+        <w:pStyle w:val="ListParagraph"/>
+        <w:numPr>
+          <w:ilvl w:val="0"/>
+          <w:numId w:val="2"/>
+        </w:numPr>
+        <w:spacing w:after="80"/>
+      </w:pPr>
+      <w:r>
+        <w:t xml:space="preserve">Cambiar tu contraseña, con el mismo indicador de fortaleza que viste al registrarte.</w:t>
+      </w:r>
+    </w:p>
+    <w:p>
+      <w:pPr>
+        <w:pStyle w:val="ListParagraph"/>
+        <w:numPr>
+          <w:ilvl w:val="0"/>
+          <w:numId w:val="2"/>
+        </w:numPr>
+        <w:spacing w:after="80"/>
+      </w:pPr>
+      <w:r>
+        <w:t xml:space="preserve">Elegir el tema claro u oscuro de toda la aplicación.</w:t>
+      </w:r>
+    </w:p>
+    <w:p>
+      <w:pPr>
+        <w:pStyle w:val="Heading1"/>
+        <w:spacing w:after="200" w:before="400"/>
+      </w:pPr>
+      <w:r>
+        <w:t xml:space="preserve">9. Recordatorios por inactividad</w:t>
+      </w:r>
+    </w:p>
+    <w:p>
+      <w:pPr>
+        <w:spacing w:after="160"/>
+      </w:pPr>
+      <w:r>
+        <w:t xml:space="preserve">Cuando una postulación lleva varios días sin ninguna novedad, sin que hayas registrado una interacción ni cambiado su estado, Laburin te lo marca con un recordatorio, para que no se te pase hacer un seguimiento.</w:t>
+      </w:r>
+    </w:p>
+    <w:p>
+      <w:pPr>
+        <w:spacing w:after="160"/>
+      </w:pPr>
+      <w:r>
+        <w:t xml:space="preserve">Vas a ver este aviso directamente en el Tablero, en la tarjeta de la postulación correspondiente (como se puede ver en la imagen de la sección sobre el Tablero). Alcanza con registrar una interacción nueva o mover la tarjeta de estado para que el recordatorio se resuelva solo.</w:t>
+      </w:r>
+    </w:p>
+    <w:p>
+      <w:pPr>
+        <w:pStyle w:val="Heading1"/>
+        <w:spacing w:after="200" w:before="400"/>
+      </w:pPr>
+      <w:r>
+        <w:t xml:space="preserve">10. Panel de Métricas</w:t>
+      </w:r>
+    </w:p>
+    <w:p>
+      <w:pPr>
+        <w:spacing w:after="160"/>
+      </w:pPr>
+      <w:r>
+        <w:t xml:space="preserve">La sección "Analytics" te muestra un resumen de toda tu búsqueda laboral: cuántas postulaciones tenés activas, cómo se reparten entre las distintas etapas del proceso, cuál es tu puntaje de afinidad promedio, y qué fuentes te están trayendo mejores ofertas.</w:t>
+      </w:r>
+    </w:p>
+    <w:p>
+      <w:pPr>
+        <w:pBdr>
+          <w:top w:val="single" w:color="CCCCCC" w:sz="4"/>
+          <w:left w:val="single" w:color="CCCCCC" w:sz="4"/>
+          <w:bottom w:val="single" w:color="CCCCCC" w:sz="4"/>
+          <w:right w:val="single" w:color="CCCCCC" w:sz="4"/>
+        </w:pBdr>
+        <w:spacing w:after="80" w:before="120"/>
+        <w:jc w:val="center"/>
+      </w:pPr>
+      <w:r>
+        <w:drawing>
+          <wp:inline distT="0" distB="0" distL="0" distR="0">
+            <wp:extent cx="5715000" cy="3209925"/>
+            <wp:effectExtent t="0" r="0" b="0" l="0"/>
+            <wp:docPr id="11" name="" descr="" title=""/>
+            <wp:cNvGraphicFramePr>
+              <a:graphicFrameLocks xmlns:a="http://schemas.openxmlformats.org/drawingml/2006/main" noChangeAspect="1"/>
+            </wp:cNvGraphicFramePr>
+            <a:graphic xmlns:a="http://schemas.openxmlformats.org/drawingml/2006/main">
+              <a:graphicData uri="http://schemas.openxmlformats.org/drawingml/2006/picture">
+                <pic:pic xmlns:pic="http://schemas.openxmlformats.org/drawingml/2006/picture">
+                  <pic:nvPicPr>
+                    <pic:cNvPr id="0" name="" descr=""/>
+                    <pic:cNvPicPr>
+                      <a:picLocks noChangeAspect="1" noChangeArrowheads="1"/>
+                    </pic:cNvPicPr>
+                  </pic:nvPicPr>
+                  <pic:blipFill>
+                    <a:blip r:embed="rId17" cstate="none"/>
                     <a:srcRect/>
                     <a:stretch>
                       <a:fillRect/>

</xml_diff>

<commit_message>
docs: Memoria Técnica y Manual de Usuario tras el pase final
Memoria: limitaciones resueltas fuera de la Sección 8, RF-14 cumplido (síntesis 12/3/2), secciones 5.5 y 5.6,
párrafo del pase con Playwright, keepNext en los títulos de requerimientos y espacio antes de la síntesis.
Manual: umbral de inactividad, paginación y selección masiva, capturas nuevas de Ofertas y Configuración.
</commit_message>
<xml_diff>
--- a/Laburin-Manual-de-Usuario.docx
+++ b/Laburin-Manual-de-Usuario.docx
@@ -319,7 +319,7 @@
         <w:spacing w:after="160"/>
       </w:pPr>
       <w:r>
-        <w:t xml:space="preserve">Si ya tenés cuenta, ingresá tu email y contraseña en la pantalla de inicio y hacé clic en "Iniciar sesión". Laburin va a recordar tu sesión, así que no vas a tener que volver a loguearte cada vez que abras la aplicación en el mismo dispositivo.</w:t>
+        <w:t xml:space="preserve">Si ya tenés cuenta, ingresá tu email y contraseña en la pantalla de inicio y hacé clic en "Ingresar". Laburin va a recordar tu sesión, así que no vas a tener que volver a loguearte cada vez que abras la aplicación en el mismo dispositivo.</w:t>
       </w:r>
     </w:p>
     <w:p>
@@ -658,7 +658,7 @@
         <w:spacing w:after="160"/>
       </w:pPr>
       <w:r>
-        <w:t xml:space="preserve">Arriba de la lista podés filtrar por fuente (de dónde salió la oferta), por ubicación, y por puntaje mínimo, para encontrar rápido las que más te interesan.</w:t>
+        <w:t xml:space="preserve">Arriba de la lista podés filtrar por fuente (de dónde salió la oferta), por ubicación, y por puntaje mínimo, para encontrar rápido las que más te interesan. Los filtros se aplican sobre todas tus ofertas, no solo sobre las que ves en pantalla.</w:t>
       </w:r>
     </w:p>
     <w:p>
@@ -667,15 +667,15 @@
         <w:spacing w:after="140" w:before="280"/>
       </w:pPr>
       <w:r>
-        <w:t xml:space="preserve">Importar ofertas automáticamente</w:t>
-      </w:r>
-    </w:p>
-    <w:p>
-      <w:pPr>
-        <w:spacing w:after="160"/>
-      </w:pPr>
-      <w:r>
-        <w:t xml:space="preserve">Tocando "Importar ofertas remotas", Laburin busca ofertas nuevas publicadas en portales de empleo remoto y las agrega a tu lista, calculando el puntaje de cada una según tus criterios. Si una oferta ya la tenías cargada, Laburin no la duplica: te va a avisar cuántas se importaron y cuántas se omitieron por estar repetidas.</w:t>
+        <w:t xml:space="preserve">Moverte entre páginas</w:t>
+      </w:r>
+    </w:p>
+    <w:p>
+      <w:pPr>
+        <w:spacing w:after="160"/>
+      </w:pPr>
+      <w:r>
+        <w:t xml:space="preserve">Las ofertas se muestran de a 30 por página. Al final de la lista vas a ver cuántas ofertas tenés en total (con los filtros que estés usando) y en qué página estás, por ejemplo "34 ofertas · Página 1 de 2", junto con los botones "Anterior" y "Siguiente" para pasar de una página a otra.</w:t>
       </w:r>
     </w:p>
     <w:p>
@@ -743,7 +743,7 @@
           <w:sz w:val="18"/>
           <w:szCs w:val="18"/>
         </w:rPr>
-        <w:t xml:space="preserve">Resultado de una importación: cuántas ofertas nuevas entraron y cuántas se omitieron por duplicadas.</w:t>
+        <w:t xml:space="preserve">Al final del listado: el total de ofertas, la página actual y los botones para cambiar de página.</w:t>
       </w:r>
     </w:p>
     <w:p>
@@ -752,74 +752,15 @@
         <w:spacing w:after="140" w:before="280"/>
       </w:pPr>
       <w:r>
-        <w:t xml:space="preserve">Cargar una oferta manualmente</w:t>
-      </w:r>
-    </w:p>
-    <w:p>
-      <w:pPr>
-        <w:spacing w:after="160"/>
-      </w:pPr>
-      <w:r>
-        <w:t xml:space="preserve">Si encontraste una oferta por tu cuenta (en LinkedIn, en la web de una empresa, por referencia de alguien), podés cargarla vos mismo con "Nueva oferta", completando empresa, puesto, modalidad, ubicación y tecnologías.</w:t>
-      </w:r>
-    </w:p>
-    <w:p>
-      <w:pPr>
-        <w:pStyle w:val="Heading2"/>
-        <w:spacing w:after="140" w:before="280"/>
-      </w:pPr>
-      <w:r>
-        <w:t xml:space="preserve">Editar o borrar una oferta</w:t>
-      </w:r>
-    </w:p>
-    <w:p>
-      <w:pPr>
-        <w:spacing w:after="160"/>
-      </w:pPr>
-      <w:r>
-        <w:t xml:space="preserve">Desde la tarjeta de cada oferta podés editarla (ícono de lápiz) o borrarla (ícono de tacho) individualmente.</w:t>
-      </w:r>
-    </w:p>
-    <w:p>
-      <w:pPr>
-        <w:spacing w:after="160"/>
-      </w:pPr>
-      <w:r>
-        <w:t xml:space="preserve">Si querés borrar varias a la vez, marcá las casillas de las ofertas que querés eliminar y usá "Eliminar seleccionadas" en la barra que aparece arriba de la lista.</w:t>
-      </w:r>
-    </w:p>
-    <w:p>
-      <w:pPr>
-        <w:pStyle w:val="Heading2"/>
-        <w:spacing w:after="140" w:before="280"/>
-      </w:pPr>
-      <w:r>
-        <w:t xml:space="preserve">Postularte</w:t>
-      </w:r>
-    </w:p>
-    <w:p>
-      <w:pPr>
-        <w:spacing w:after="160"/>
-      </w:pPr>
-      <w:r>
-        <w:t xml:space="preserve">Cuando encontrás una oferta a la que querés postularte, tocá "Postularme". Esto la va a mover al Tablero, en la columna "Por aplicar", para que empieces a hacerle seguimiento.</w:t>
-      </w:r>
-    </w:p>
-    <w:p>
-      <w:pPr>
-        <w:pStyle w:val="Heading1"/>
-        <w:spacing w:after="200" w:before="400"/>
-      </w:pPr>
-      <w:r>
-        <w:t xml:space="preserve">5. Tablero Kanban</w:t>
-      </w:r>
-    </w:p>
-    <w:p>
-      <w:pPr>
-        <w:spacing w:after="160"/>
-      </w:pPr>
-      <w:r>
-        <w:t xml:space="preserve">El Tablero es donde seguís el estado de cada postulación, desde que decidís postularte hasta que termina el proceso.</w:t>
+        <w:t xml:space="preserve">Importar ofertas automáticamente</w:t>
+      </w:r>
+    </w:p>
+    <w:p>
+      <w:pPr>
+        <w:spacing w:after="160"/>
+      </w:pPr>
+      <w:r>
+        <w:t xml:space="preserve">Tocando "Importar ofertas remotas", Laburin busca ofertas nuevas publicadas en portales de empleo remoto y las agrega a tu lista, calculando el puntaje de cada una según tus criterios. Si una oferta ya la tenías cargada, Laburin no la duplica: te va a avisar cuántas se importaron y cuántas se omitieron por estar repetidas.</w:t>
       </w:r>
     </w:p>
     <w:p>
@@ -887,15 +828,7 @@
           <w:sz w:val="18"/>
           <w:szCs w:val="18"/>
         </w:rPr>
-        <w:t xml:space="preserve">Tablero Kanban en computadora, con las seis columnas del proceso.</w:t>
-      </w:r>
-    </w:p>
-    <w:p>
-      <w:pPr>
-        <w:spacing w:after="160"/>
-      </w:pPr>
-      <w:r>
-        <w:t xml:space="preserve">Tiene seis columnas: Por aplicar, Aplicado, En proceso, Entrevista, Oferta y Rechazado. Cada postulación es una tarjeta que vas moviendo de columna a medida que avanza el proceso.</w:t>
+        <w:t xml:space="preserve">Resultado de una importación: cuántas ofertas nuevas entraron y cuántas se omitieron por duplicadas.</w:t>
       </w:r>
     </w:p>
     <w:p>
@@ -904,15 +837,15 @@
         <w:spacing w:after="140" w:before="280"/>
       </w:pPr>
       <w:r>
-        <w:t xml:space="preserve">En computadora</w:t>
-      </w:r>
-    </w:p>
-    <w:p>
-      <w:pPr>
-        <w:spacing w:after="160"/>
-      </w:pPr>
-      <w:r>
-        <w:t xml:space="preserve">Podés arrastrar la tarjeta de una columna a otra con el mouse: hacé clic, mantené presionado y soltá en la columna que corresponda.</w:t>
+        <w:t xml:space="preserve">Cargar una oferta manualmente</w:t>
+      </w:r>
+    </w:p>
+    <w:p>
+      <w:pPr>
+        <w:spacing w:after="160"/>
+      </w:pPr>
+      <w:r>
+        <w:t xml:space="preserve">Si encontraste una oferta por tu cuenta (en LinkedIn, en la web de una empresa, por referencia de alguien), podés cargarla vos mismo con "Nueva oferta", completando empresa, puesto, modalidad, ubicación y tecnologías.</w:t>
       </w:r>
     </w:p>
     <w:p>
@@ -921,15 +854,57 @@
         <w:spacing w:after="140" w:before="280"/>
       </w:pPr>
       <w:r>
-        <w:t xml:space="preserve">En el celular</w:t>
-      </w:r>
-    </w:p>
-    <w:p>
-      <w:pPr>
-        <w:spacing w:after="160"/>
-      </w:pPr>
-      <w:r>
-        <w:t xml:space="preserve">Como arrastrar con el dedo en una pantalla chica puede ser poco preciso, en el celular cada tarjeta tiene un selector "Mover a...": tocás la tarjeta, elegís la columna de destino en la lista, y listo.</w:t>
+        <w:t xml:space="preserve">Editar o borrar una oferta</w:t>
+      </w:r>
+    </w:p>
+    <w:p>
+      <w:pPr>
+        <w:spacing w:after="160"/>
+      </w:pPr>
+      <w:r>
+        <w:t xml:space="preserve">Desde la tarjeta de cada oferta podés editarla (ícono de lápiz) o borrarla (ícono de tacho) individualmente.</w:t>
+      </w:r>
+    </w:p>
+    <w:p>
+      <w:pPr>
+        <w:spacing w:after="160"/>
+      </w:pPr>
+      <w:r>
+        <w:t xml:space="preserve">Si querés borrar varias a la vez, marcá las casillas de las ofertas que querés eliminar y usá "Eliminar seleccionadas" en la barra que aparece arriba de la lista. La casilla "Seleccionar esta página" marca las ofertas que estás viendo; si tenés más de una página, aparece además el enlace "Seleccionar las N ofertas que coinciden", que marca todas las que cumplen los filtros que estás usando, estén en la página que estén. El botón "Eliminar seleccionadas" siempre te dice cuántas vas a borrar, y antes de hacerlo Laburin te pide confirmación.</w:t>
+      </w:r>
+    </w:p>
+    <w:p>
+      <w:pPr>
+        <w:pStyle w:val="Heading2"/>
+        <w:spacing w:after="140" w:before="280"/>
+      </w:pPr>
+      <w:r>
+        <w:t xml:space="preserve">Postularte</w:t>
+      </w:r>
+    </w:p>
+    <w:p>
+      <w:pPr>
+        <w:spacing w:after="160"/>
+      </w:pPr>
+      <w:r>
+        <w:t xml:space="preserve">Cuando encontrás una oferta a la que querés postularte, tocá "Postularme". Esto la va a mover al Tablero, en la columna "Por aplicar", para que empieces a hacerle seguimiento.</w:t>
+      </w:r>
+    </w:p>
+    <w:p>
+      <w:pPr>
+        <w:pStyle w:val="Heading1"/>
+        <w:spacing w:after="200" w:before="400"/>
+      </w:pPr>
+      <w:r>
+        <w:t xml:space="preserve">5. Tablero Kanban</w:t>
+      </w:r>
+    </w:p>
+    <w:p>
+      <w:pPr>
+        <w:spacing w:after="160"/>
+      </w:pPr>
+      <w:r>
+        <w:t xml:space="preserve">El Tablero es donde seguís el estado de cada postulación, desde que decidís postularte hasta que termina el proceso.</w:t>
       </w:r>
     </w:p>
     <w:p>
@@ -946,7 +921,7 @@
       <w:r>
         <w:drawing>
           <wp:inline distT="0" distB="0" distL="0" distR="0">
-            <wp:extent cx="2190750" cy="4724400"/>
+            <wp:extent cx="5715000" cy="3209925"/>
             <wp:effectExtent t="0" r="0" b="0" l="0"/>
             <wp:docPr id="7" name="" descr="" title=""/>
             <wp:cNvGraphicFramePr>
@@ -971,7 +946,7 @@
                   <pic:spPr bwMode="auto">
                     <a:xfrm>
                       <a:off x="0" y="0"/>
-                      <a:ext cx="2190750" cy="4724400"/>
+                      <a:ext cx="5715000" cy="3209925"/>
                     </a:xfrm>
                     <a:prstGeom prst="rect">
                       <a:avLst/>
@@ -997,32 +972,49 @@
           <w:sz w:val="18"/>
           <w:szCs w:val="18"/>
         </w:rPr>
-        <w:t xml:space="preserve">En el celular, un selector reemplaza al arrastre para cambiar de columna.</w:t>
-      </w:r>
-    </w:p>
-    <w:p>
-      <w:pPr>
-        <w:spacing w:after="160"/>
-      </w:pPr>
-      <w:r>
-        <w:t xml:space="preserve">Laburin guarda el historial de cada cambio de estado, así que siempre queda registro de cuándo pasó cada postulación de una etapa a otra.</w:t>
-      </w:r>
-    </w:p>
-    <w:p>
-      <w:pPr>
-        <w:pStyle w:val="Heading1"/>
-        <w:spacing w:after="200" w:before="400"/>
-      </w:pPr>
-      <w:r>
-        <w:t xml:space="preserve">6. Ficha de Postulación</w:t>
-      </w:r>
-    </w:p>
-    <w:p>
-      <w:pPr>
-        <w:spacing w:after="160"/>
-      </w:pPr>
-      <w:r>
-        <w:t xml:space="preserve">Si tocás una tarjeta del Tablero, se abre la Ficha de esa postulación, con todos los detalles de la oferta y una línea de tiempo con cada contacto que tuviste con la empresa.</w:t>
+        <w:t xml:space="preserve">Tablero Kanban en computadora, con las seis columnas del proceso.</w:t>
+      </w:r>
+    </w:p>
+    <w:p>
+      <w:pPr>
+        <w:spacing w:after="160"/>
+      </w:pPr>
+      <w:r>
+        <w:t xml:space="preserve">Tiene seis columnas: Por aplicar, Aplicado, En proceso, Entrevista, Oferta y Rechazado. Cada postulación es una tarjeta que vas moviendo de columna a medida que avanza el proceso.</w:t>
+      </w:r>
+    </w:p>
+    <w:p>
+      <w:pPr>
+        <w:pStyle w:val="Heading2"/>
+        <w:spacing w:after="140" w:before="280"/>
+      </w:pPr>
+      <w:r>
+        <w:t xml:space="preserve">En computadora</w:t>
+      </w:r>
+    </w:p>
+    <w:p>
+      <w:pPr>
+        <w:spacing w:after="160"/>
+      </w:pPr>
+      <w:r>
+        <w:t xml:space="preserve">Podés arrastrar la tarjeta de una columna a otra con el mouse: hacé clic, mantené presionado y soltá en la columna que corresponda.</w:t>
+      </w:r>
+    </w:p>
+    <w:p>
+      <w:pPr>
+        <w:pStyle w:val="Heading2"/>
+        <w:spacing w:after="140" w:before="280"/>
+      </w:pPr>
+      <w:r>
+        <w:t xml:space="preserve">En el celular</w:t>
+      </w:r>
+    </w:p>
+    <w:p>
+      <w:pPr>
+        <w:spacing w:after="160"/>
+      </w:pPr>
+      <w:r>
+        <w:t xml:space="preserve">Como arrastrar con el dedo en una pantalla chica puede ser poco preciso, en el celular cada tarjeta tiene un selector "Mover a...": tocás la tarjeta, elegís la columna de destino en la lista, y listo.</w:t>
       </w:r>
     </w:p>
     <w:p>
@@ -1039,7 +1031,7 @@
       <w:r>
         <w:drawing>
           <wp:inline distT="0" distB="0" distL="0" distR="0">
-            <wp:extent cx="5715000" cy="3209925"/>
+            <wp:extent cx="2190750" cy="4724400"/>
             <wp:effectExtent t="0" r="0" b="0" l="0"/>
             <wp:docPr id="8" name="" descr="" title=""/>
             <wp:cNvGraphicFramePr>
@@ -1064,7 +1056,7 @@
                   <pic:spPr bwMode="auto">
                     <a:xfrm>
                       <a:off x="0" y="0"/>
-                      <a:ext cx="5715000" cy="3209925"/>
+                      <a:ext cx="2190750" cy="4724400"/>
                     </a:xfrm>
                     <a:prstGeom prst="rect">
                       <a:avLst/>
@@ -1090,49 +1082,15 @@
           <w:sz w:val="18"/>
           <w:szCs w:val="18"/>
         </w:rPr>
-        <w:t xml:space="preserve">Ficha de una postulación, con el timeline de interacciones registradas.</w:t>
-      </w:r>
-    </w:p>
-    <w:p>
-      <w:pPr>
-        <w:pStyle w:val="Heading2"/>
-        <w:spacing w:after="140" w:before="280"/>
-      </w:pPr>
-      <w:r>
-        <w:t xml:space="preserve">Agregar una interacción</w:t>
-      </w:r>
-    </w:p>
-    <w:p>
-      <w:pPr>
-        <w:spacing w:after="160"/>
-      </w:pPr>
-      <w:r>
-        <w:t xml:space="preserve">Cada vez que tengas novedades (te mandaron un mail, te llamaron, tuviste una entrevista), podés registrarlo como una interacción: elegís el tipo, la fecha, y podés agregar una nota con el detalle.</w:t>
-      </w:r>
-    </w:p>
-    <w:p>
-      <w:pPr>
-        <w:spacing w:after="160"/>
-      </w:pPr>
-      <w:r>
-        <w:t xml:space="preserve">Esto te sirve para no perder el hilo de en qué quedó cada proceso, sobre todo cuando tenés varias postulaciones activas al mismo tiempo.</w:t>
-      </w:r>
-    </w:p>
-    <w:p>
-      <w:pPr>
-        <w:pStyle w:val="Heading2"/>
-        <w:spacing w:after="140" w:before="280"/>
-      </w:pPr>
-      <w:r>
-        <w:t xml:space="preserve">Borrar una interacción</w:t>
-      </w:r>
-    </w:p>
-    <w:p>
-      <w:pPr>
-        <w:spacing w:after="160"/>
-      </w:pPr>
-      <w:r>
-        <w:t xml:space="preserve">Si cargaste una interacción por error, podés borrarla desde la misma línea de tiempo.</w:t>
+        <w:t xml:space="preserve">En el celular, un selector reemplaza al arrastre para cambiar de columna.</w:t>
+      </w:r>
+    </w:p>
+    <w:p>
+      <w:pPr>
+        <w:spacing w:after="160"/>
+      </w:pPr>
+      <w:r>
+        <w:t xml:space="preserve">Laburin guarda el historial de cada cambio de estado, así que siempre queda registro de cuándo pasó cada postulación de una etapa a otra.</w:t>
       </w:r>
     </w:p>
     <w:p>
@@ -1141,15 +1099,15 @@
         <w:spacing w:after="200" w:before="400"/>
       </w:pPr>
       <w:r>
-        <w:t xml:space="preserve">7. Configuración del motor de scoring</w:t>
-      </w:r>
-    </w:p>
-    <w:p>
-      <w:pPr>
-        <w:spacing w:after="160"/>
-      </w:pPr>
-      <w:r>
-        <w:t xml:space="preserve">En "Configuración" definís las reglas que Laburin usa para calcular el puntaje de afinidad de cada oferta.</w:t>
+        <w:t xml:space="preserve">6. Ficha de Postulación</w:t>
+      </w:r>
+    </w:p>
+    <w:p>
+      <w:pPr>
+        <w:spacing w:after="160"/>
+      </w:pPr>
+      <w:r>
+        <w:t xml:space="preserve">Si tocás una tarjeta del Tablero, se abre la Ficha de esa postulación, con todos los detalles de la oferta y una línea de tiempo con cada contacto que tuviste con la empresa.</w:t>
       </w:r>
     </w:p>
     <w:p>
@@ -1217,7 +1175,7 @@
           <w:sz w:val="18"/>
           <w:szCs w:val="18"/>
         </w:rPr>
-        <w:t xml:space="preserve">Pantalla de Configuración, con los criterios de afinidad y su peso.</w:t>
+        <w:t xml:space="preserve">Ficha de una postulación, con el timeline de interacciones registradas.</w:t>
       </w:r>
     </w:p>
     <w:p>
@@ -1226,15 +1184,23 @@
         <w:spacing w:after="140" w:before="280"/>
       </w:pPr>
       <w:r>
-        <w:t xml:space="preserve">Qué es un criterio</w:t>
-      </w:r>
-    </w:p>
-    <w:p>
-      <w:pPr>
-        <w:spacing w:after="160"/>
-      </w:pPr>
-      <w:r>
-        <w:t xml:space="preserve">Un criterio es una regla simple: "si la oferta menciona tal cosa, sumale tantos puntos". Por ejemplo: "si el stack tecnológico incluye React, sumar 15 puntos", o "si la modalidad es remoto, sumar 10 puntos".</w:t>
+        <w:t xml:space="preserve">Agregar una interacción</w:t>
+      </w:r>
+    </w:p>
+    <w:p>
+      <w:pPr>
+        <w:spacing w:after="160"/>
+      </w:pPr>
+      <w:r>
+        <w:t xml:space="preserve">Cada vez que tengas novedades (te mandaron un mail, te llamaron, tuviste una entrevista), podés registrarlo como una interacción: elegís el tipo, la fecha, y podés agregar una nota con el detalle.</w:t>
+      </w:r>
+    </w:p>
+    <w:p>
+      <w:pPr>
+        <w:spacing w:after="160"/>
+      </w:pPr>
+      <w:r>
+        <w:t xml:space="preserve">Esto te sirve para no perder el hilo de en qué quedó cada proceso, sobre todo cuando tenés varias postulaciones activas al mismo tiempo.</w:t>
       </w:r>
     </w:p>
     <w:p>
@@ -1243,49 +1209,15 @@
         <w:spacing w:after="140" w:before="280"/>
       </w:pPr>
       <w:r>
-        <w:t xml:space="preserve">Peso</w:t>
-      </w:r>
-    </w:p>
-    <w:p>
-      <w:pPr>
-        <w:spacing w:after="160"/>
-      </w:pPr>
-      <w:r>
-        <w:t xml:space="preserve">El "peso" es la cantidad de puntos que suma ese criterio cuando se cumple. Los criterios con más peso tienen más influencia en el puntaje final: usalo para priorizar lo que más te importa. Por ejemplo, si trabajar en modalidad remoto es innegociable para vos, dale más peso que a una tecnología secundaria.</w:t>
-      </w:r>
-    </w:p>
-    <w:p>
-      <w:pPr>
-        <w:pStyle w:val="Heading2"/>
-        <w:spacing w:after="140" w:before="280"/>
-      </w:pPr>
-      <w:r>
-        <w:t xml:space="preserve">Agregar un nuevo criterio</w:t>
-      </w:r>
-    </w:p>
-    <w:p>
-      <w:pPr>
-        <w:spacing w:after="160"/>
-      </w:pPr>
-      <w:r>
-        <w:t xml:space="preserve">Tocá "Agregar criterio", elegí qué campo de la oferta mirar (tecnologías, modalidad, ubicación, rol, etc.), qué valor buscar, y cuántos puntos sumar si se cumple. También podés desactivar un criterio sin borrarlo, si por ahora no lo querés tener en cuenta.</w:t>
-      </w:r>
-    </w:p>
-    <w:p>
-      <w:pPr>
-        <w:pStyle w:val="Heading2"/>
-        <w:spacing w:after="140" w:before="280"/>
-      </w:pPr>
-      <w:r>
-        <w:t xml:space="preserve">Qué pasa con las ofertas que ya tenías cargadas</w:t>
-      </w:r>
-    </w:p>
-    <w:p>
-      <w:pPr>
-        <w:spacing w:after="160"/>
-      </w:pPr>
-      <w:r>
-        <w:t xml:space="preserve">Cada vez que agregás, editás, desactivás o borrás un criterio, Laburin recalcula automáticamente el puntaje de todas las ofertas que ya tenías guardadas: no hace falta que hagas nada más. Si entrás a Ofertas después de cambiar un criterio, vas a ver los puntajes actualizados al instante.</w:t>
+        <w:t xml:space="preserve">Borrar una interacción</w:t>
+      </w:r>
+    </w:p>
+    <w:p>
+      <w:pPr>
+        <w:spacing w:after="160"/>
+      </w:pPr>
+      <w:r>
+        <w:t xml:space="preserve">Si cargaste una interacción por error, podés borrarla desde la misma línea de tiempo.</w:t>
       </w:r>
     </w:p>
     <w:p>
@@ -1294,23 +1226,15 @@
         <w:spacing w:after="200" w:before="400"/>
       </w:pPr>
       <w:r>
-        <w:t xml:space="preserve">8. Mi cuenta</w:t>
-      </w:r>
-    </w:p>
-    <w:p>
-      <w:pPr>
-        <w:spacing w:after="160"/>
-      </w:pPr>
-      <w:r>
-        <w:t xml:space="preserve">Además de la configuración del motor de scoring, tenés una sección aparte para los datos de tu propia cuenta: tu nombre, tu contraseña y el tema de la aplicación.</w:t>
-      </w:r>
-    </w:p>
-    <w:p>
-      <w:pPr>
-        <w:spacing w:after="160"/>
-      </w:pPr>
-      <w:r>
-        <w:t xml:space="preserve">Para acceder, tocá "Mi cuenta" en el menú lateral, arriba de "Cerrar Sesión".</w:t>
+        <w:t xml:space="preserve">7. Configuración del motor de scoring</w:t>
+      </w:r>
+    </w:p>
+    <w:p>
+      <w:pPr>
+        <w:spacing w:after="160"/>
+      </w:pPr>
+      <w:r>
+        <w:t xml:space="preserve">En "Configuración" definís las reglas que Laburin usa para calcular el puntaje de afinidad de cada oferta.</w:t>
       </w:r>
     </w:p>
     <w:p>
@@ -1378,67 +1302,108 @@
           <w:sz w:val="18"/>
           <w:szCs w:val="18"/>
         </w:rPr>
-        <w:t xml:space="preserve">Ventana de "Mi cuenta": nombre, email, cambio de contraseña y tema.</w:t>
-      </w:r>
-    </w:p>
-    <w:p>
-      <w:pPr>
-        <w:spacing w:after="160"/>
-      </w:pPr>
-      <w:r>
-        <w:t xml:space="preserve">Ahí podés:</w:t>
-      </w:r>
-    </w:p>
-    <w:p>
-      <w:pPr>
-        <w:pStyle w:val="ListParagraph"/>
-        <w:numPr>
-          <w:ilvl w:val="0"/>
-          <w:numId w:val="2"/>
-        </w:numPr>
-        <w:spacing w:after="80"/>
-      </w:pPr>
-      <w:r>
-        <w:t xml:space="preserve">Cambiar tu nombre para mostrar (se usa junto con tus iniciales, que aparecen como tu avatar).</w:t>
-      </w:r>
-    </w:p>
-    <w:p>
-      <w:pPr>
-        <w:pStyle w:val="ListParagraph"/>
-        <w:numPr>
-          <w:ilvl w:val="0"/>
-          <w:numId w:val="2"/>
-        </w:numPr>
-        <w:spacing w:after="80"/>
-      </w:pPr>
-      <w:r>
-        <w:t xml:space="preserve">Ver el email con el que te registraste (no se puede editar desde acá).</w:t>
-      </w:r>
-    </w:p>
-    <w:p>
-      <w:pPr>
-        <w:pStyle w:val="ListParagraph"/>
-        <w:numPr>
-          <w:ilvl w:val="0"/>
-          <w:numId w:val="2"/>
-        </w:numPr>
-        <w:spacing w:after="80"/>
-      </w:pPr>
-      <w:r>
-        <w:t xml:space="preserve">Cambiar tu contraseña, con el mismo indicador de fortaleza que viste al registrarte.</w:t>
-      </w:r>
-    </w:p>
-    <w:p>
-      <w:pPr>
-        <w:pStyle w:val="ListParagraph"/>
-        <w:numPr>
-          <w:ilvl w:val="0"/>
-          <w:numId w:val="2"/>
-        </w:numPr>
-        <w:spacing w:after="80"/>
-      </w:pPr>
-      <w:r>
-        <w:t xml:space="preserve">Elegir el tema claro u oscuro de toda la aplicación.</w:t>
+        <w:t xml:space="preserve">Pantalla de Configuración, con los criterios de afinidad y su peso.</w:t>
+      </w:r>
+    </w:p>
+    <w:p>
+      <w:pPr>
+        <w:pStyle w:val="Heading2"/>
+        <w:spacing w:after="140" w:before="280"/>
+      </w:pPr>
+      <w:r>
+        <w:t xml:space="preserve">Qué es un criterio</w:t>
+      </w:r>
+    </w:p>
+    <w:p>
+      <w:pPr>
+        <w:spacing w:after="160"/>
+      </w:pPr>
+      <w:r>
+        <w:t xml:space="preserve">Un criterio es una regla simple: "si la oferta menciona tal cosa, sumale tantos puntos". Por ejemplo: "si el stack tecnológico incluye React, sumar 15 puntos", o "si la modalidad es remoto, sumar 10 puntos".</w:t>
+      </w:r>
+    </w:p>
+    <w:p>
+      <w:pPr>
+        <w:pStyle w:val="Heading2"/>
+        <w:spacing w:after="140" w:before="280"/>
+      </w:pPr>
+      <w:r>
+        <w:t xml:space="preserve">Peso</w:t>
+      </w:r>
+    </w:p>
+    <w:p>
+      <w:pPr>
+        <w:spacing w:after="160"/>
+      </w:pPr>
+      <w:r>
+        <w:t xml:space="preserve">El "peso" es la cantidad de puntos que suma ese criterio cuando se cumple. Los criterios con más peso tienen más influencia en el puntaje final: usalo para priorizar lo que más te importa. Por ejemplo, si trabajar en modalidad remoto es innegociable para vos, dale más peso que a una tecnología secundaria.</w:t>
+      </w:r>
+    </w:p>
+    <w:p>
+      <w:pPr>
+        <w:pStyle w:val="Heading2"/>
+        <w:spacing w:after="140" w:before="280"/>
+      </w:pPr>
+      <w:r>
+        <w:t xml:space="preserve">Agregar un nuevo criterio</w:t>
+      </w:r>
+    </w:p>
+    <w:p>
+      <w:pPr>
+        <w:spacing w:after="160"/>
+      </w:pPr>
+      <w:r>
+        <w:t xml:space="preserve">Tocá "Agregar criterio", elegí qué campo de la oferta mirar (tecnologías, modalidad, ubicación, rol, etc.), qué valor buscar, y cuántos puntos sumar si se cumple. También podés desactivar un criterio sin borrarlo, si por ahora no lo querés tener en cuenta.</w:t>
+      </w:r>
+    </w:p>
+    <w:p>
+      <w:pPr>
+        <w:pStyle w:val="Heading2"/>
+        <w:spacing w:after="140" w:before="280"/>
+      </w:pPr>
+      <w:r>
+        <w:t xml:space="preserve">Umbral de inactividad</w:t>
+      </w:r>
+    </w:p>
+    <w:p>
+      <w:pPr>
+        <w:spacing w:after="160"/>
+      </w:pPr>
+      <w:r>
+        <w:t xml:space="preserve">Arriba de los criterios, en la tarjeta "Umbral de Inactividad", elegís después de cuántos días sin novedades querés que Laburin te avise sobre una postulación. Por defecto son 7 días, y podés poner cualquier número entero entre 1 y 90.</w:t>
+      </w:r>
+    </w:p>
+    <w:p>
+      <w:pPr>
+        <w:spacing w:after="160"/>
+      </w:pPr>
+      <w:r>
+        <w:t xml:space="preserve">Escribí el número y salí del campo (o apretá Enter): el valor se guarda solo y se mantiene aunque cierres la sesión. Si ponés un valor que no corresponde, por ejemplo 0 o 100, Laburin te avisa y vuelve al último valor válido.</w:t>
+      </w:r>
+    </w:p>
+    <w:p>
+      <w:pPr>
+        <w:spacing w:after="160"/>
+      </w:pPr>
+      <w:r>
+        <w:t xml:space="preserve">El cambio vale hacia adelante: los avisos que ya tenías no desaparecen ni se recalculan. Si bajás el umbral, las postulaciones que ya llevan más días que el nuevo valor van a mostrar su aviso la próxima vez que abras el Tablero; si lo subís, los avisos que ya estaban siguen hasta que los resuelvas.</w:t>
+      </w:r>
+    </w:p>
+    <w:p>
+      <w:pPr>
+        <w:pStyle w:val="Heading2"/>
+        <w:spacing w:after="140" w:before="280"/>
+      </w:pPr>
+      <w:r>
+        <w:t xml:space="preserve">Qué pasa con las ofertas que ya tenías cargadas</w:t>
+      </w:r>
+    </w:p>
+    <w:p>
+      <w:pPr>
+        <w:spacing w:after="160"/>
+      </w:pPr>
+      <w:r>
+        <w:t xml:space="preserve">Cada vez que agregás, editás, desactivás o borrás un criterio, Laburin recalcula automáticamente el puntaje de todas las ofertas que ya tenías guardadas: no hace falta que hagas nada más. Si entrás a Ofertas después de cambiar un criterio, vas a ver los puntajes actualizados al instante.</w:t>
       </w:r>
     </w:p>
     <w:p>
@@ -1447,40 +1412,23 @@
         <w:spacing w:after="200" w:before="400"/>
       </w:pPr>
       <w:r>
-        <w:t xml:space="preserve">9. Recordatorios por inactividad</w:t>
-      </w:r>
-    </w:p>
-    <w:p>
-      <w:pPr>
-        <w:spacing w:after="160"/>
-      </w:pPr>
-      <w:r>
-        <w:t xml:space="preserve">Cuando una postulación lleva varios días sin ninguna novedad, sin que hayas registrado una interacción ni cambiado su estado, Laburin te lo marca con un recordatorio, para que no se te pase hacer un seguimiento.</w:t>
-      </w:r>
-    </w:p>
-    <w:p>
-      <w:pPr>
-        <w:spacing w:after="160"/>
-      </w:pPr>
-      <w:r>
-        <w:t xml:space="preserve">Vas a ver este aviso directamente en el Tablero, en la tarjeta de la postulación correspondiente (como se puede ver en la imagen de la sección sobre el Tablero). Alcanza con registrar una interacción nueva o mover la tarjeta de estado para que el recordatorio se resuelva solo.</w:t>
-      </w:r>
-    </w:p>
-    <w:p>
-      <w:pPr>
-        <w:pStyle w:val="Heading1"/>
-        <w:spacing w:after="200" w:before="400"/>
-      </w:pPr>
-      <w:r>
-        <w:t xml:space="preserve">10. Panel de Métricas</w:t>
-      </w:r>
-    </w:p>
-    <w:p>
-      <w:pPr>
-        <w:spacing w:after="160"/>
-      </w:pPr>
-      <w:r>
-        <w:t xml:space="preserve">La sección "Analytics" te muestra un resumen de toda tu búsqueda laboral: cuántas postulaciones tenés activas, cómo se reparten entre las distintas etapas del proceso, cuál es tu puntaje de afinidad promedio, y qué fuentes te están trayendo mejores ofertas.</w:t>
+        <w:t xml:space="preserve">8. Mi cuenta</w:t>
+      </w:r>
+    </w:p>
+    <w:p>
+      <w:pPr>
+        <w:spacing w:after="160"/>
+      </w:pPr>
+      <w:r>
+        <w:t xml:space="preserve">Además de la configuración del motor de scoring, tenés una sección aparte para los datos de tu propia cuenta: tu nombre, tu contraseña y el tema de la aplicación.</w:t>
+      </w:r>
+    </w:p>
+    <w:p>
+      <w:pPr>
+        <w:spacing w:after="160"/>
+      </w:pPr>
+      <w:r>
+        <w:t xml:space="preserve">Para acceder, tocá "Mi cuenta" en el menú lateral, arriba de "Cerrar Sesión".</w:t>
       </w:r>
     </w:p>
     <w:p>
@@ -1514,6 +1462,184 @@
                   </pic:nvPicPr>
                   <pic:blipFill>
                     <a:blip r:embed="rId17" cstate="none"/>
+                    <a:srcRect/>
+                    <a:stretch>
+                      <a:fillRect/>
+                    </a:stretch>
+                  </pic:blipFill>
+                  <pic:spPr bwMode="auto">
+                    <a:xfrm>
+                      <a:off x="0" y="0"/>
+                      <a:ext cx="5715000" cy="3209925"/>
+                    </a:xfrm>
+                    <a:prstGeom prst="rect">
+                      <a:avLst/>
+                    </a:prstGeom>
+                  </pic:spPr>
+                </pic:pic>
+              </a:graphicData>
+            </a:graphic>
+          </wp:inline>
+        </w:drawing>
+      </w:r>
+    </w:p>
+    <w:p>
+      <w:pPr>
+        <w:spacing w:after="220"/>
+        <w:jc w:val="center"/>
+      </w:pPr>
+      <w:r>
+        <w:rPr>
+          <w:i/>
+          <w:iCs/>
+          <w:color w:val="555555"/>
+          <w:sz w:val="18"/>
+          <w:szCs w:val="18"/>
+        </w:rPr>
+        <w:t xml:space="preserve">Ventana de "Mi cuenta": nombre, email, cambio de contraseña y tema.</w:t>
+      </w:r>
+    </w:p>
+    <w:p>
+      <w:pPr>
+        <w:spacing w:after="160"/>
+      </w:pPr>
+      <w:r>
+        <w:t xml:space="preserve">Ahí podés:</w:t>
+      </w:r>
+    </w:p>
+    <w:p>
+      <w:pPr>
+        <w:pStyle w:val="ListParagraph"/>
+        <w:numPr>
+          <w:ilvl w:val="0"/>
+          <w:numId w:val="2"/>
+        </w:numPr>
+        <w:spacing w:after="80"/>
+      </w:pPr>
+      <w:r>
+        <w:t xml:space="preserve">Cambiar tu nombre para mostrar (se usa junto con tus iniciales, que aparecen como tu avatar).</w:t>
+      </w:r>
+    </w:p>
+    <w:p>
+      <w:pPr>
+        <w:pStyle w:val="ListParagraph"/>
+        <w:numPr>
+          <w:ilvl w:val="0"/>
+          <w:numId w:val="2"/>
+        </w:numPr>
+        <w:spacing w:after="80"/>
+      </w:pPr>
+      <w:r>
+        <w:t xml:space="preserve">Ver el email con el que te registraste (no se puede editar desde acá).</w:t>
+      </w:r>
+    </w:p>
+    <w:p>
+      <w:pPr>
+        <w:pStyle w:val="ListParagraph"/>
+        <w:numPr>
+          <w:ilvl w:val="0"/>
+          <w:numId w:val="2"/>
+        </w:numPr>
+        <w:spacing w:after="80"/>
+      </w:pPr>
+      <w:r>
+        <w:t xml:space="preserve">Cambiar tu contraseña, con el mismo indicador de fortaleza que viste al registrarte.</w:t>
+      </w:r>
+    </w:p>
+    <w:p>
+      <w:pPr>
+        <w:pStyle w:val="ListParagraph"/>
+        <w:numPr>
+          <w:ilvl w:val="0"/>
+          <w:numId w:val="2"/>
+        </w:numPr>
+        <w:spacing w:after="80"/>
+      </w:pPr>
+      <w:r>
+        <w:t xml:space="preserve">Elegir el tema claro u oscuro de toda la aplicación.</w:t>
+      </w:r>
+    </w:p>
+    <w:p>
+      <w:pPr>
+        <w:pStyle w:val="Heading1"/>
+        <w:spacing w:after="200" w:before="400"/>
+      </w:pPr>
+      <w:r>
+        <w:t xml:space="preserve">9. Recordatorios por inactividad</w:t>
+      </w:r>
+    </w:p>
+    <w:p>
+      <w:pPr>
+        <w:spacing w:after="160"/>
+      </w:pPr>
+      <w:r>
+        <w:t xml:space="preserve">Cuando una postulación lleva varios días sin ninguna novedad, sin que hayas registrado una interacción ni cambiado su estado, Laburin te lo marca con un recordatorio, para que no se te pase hacer un seguimiento.</w:t>
+      </w:r>
+    </w:p>
+    <w:p>
+      <w:pPr>
+        <w:spacing w:after="160"/>
+      </w:pPr>
+      <w:r>
+        <w:t xml:space="preserve">Vos elegís después de cuántos días se avisa: es el "Umbral de Inactividad" que ajustás en Configuración (por defecto, 7 días; ver la sección 7). Si lo cambiás, el nuevo plazo se aplica de ahí en adelante y los avisos que ya tenías no se modifican.</w:t>
+      </w:r>
+    </w:p>
+    <w:p>
+      <w:pPr>
+        <w:spacing w:after="160"/>
+      </w:pPr>
+      <w:r>
+        <w:t xml:space="preserve">Vas a ver este aviso directamente en el Tablero, en la tarjeta de la postulación correspondiente (como se puede ver en la imagen de la sección sobre el Tablero). Alcanza con registrar una interacción nueva o mover la tarjeta de estado para que el recordatorio se resuelva solo.</w:t>
+      </w:r>
+    </w:p>
+    <w:p>
+      <w:pPr>
+        <w:pStyle w:val="Heading1"/>
+        <w:spacing w:after="200" w:before="400"/>
+      </w:pPr>
+      <w:r>
+        <w:t xml:space="preserve">10. Panel de Métricas</w:t>
+      </w:r>
+    </w:p>
+    <w:p>
+      <w:pPr>
+        <w:spacing w:after="160"/>
+      </w:pPr>
+      <w:r>
+        <w:t xml:space="preserve">La sección "Analytics" te muestra un resumen de toda tu búsqueda laboral: cuántas postulaciones tenés activas, cómo se reparten entre las distintas etapas del proceso, cuál es tu puntaje de afinidad promedio, y qué fuentes te están trayendo mejores ofertas.</w:t>
+      </w:r>
+    </w:p>
+    <w:p>
+      <w:pPr>
+        <w:pBdr>
+          <w:top w:val="single" w:color="CCCCCC" w:sz="4"/>
+          <w:left w:val="single" w:color="CCCCCC" w:sz="4"/>
+          <w:bottom w:val="single" w:color="CCCCCC" w:sz="4"/>
+          <w:right w:val="single" w:color="CCCCCC" w:sz="4"/>
+        </w:pBdr>
+        <w:spacing w:after="80" w:before="120"/>
+        <w:jc w:val="center"/>
+      </w:pPr>
+      <w:r>
+        <w:drawing>
+          <wp:inline distT="0" distB="0" distL="0" distR="0">
+            <wp:extent cx="5715000" cy="3209925"/>
+            <wp:effectExtent t="0" r="0" b="0" l="0"/>
+            <wp:docPr id="12" name="" descr="" title=""/>
+            <wp:cNvGraphicFramePr>
+              <a:graphicFrameLocks xmlns:a="http://schemas.openxmlformats.org/drawingml/2006/main" noChangeAspect="1"/>
+            </wp:cNvGraphicFramePr>
+            <a:graphic xmlns:a="http://schemas.openxmlformats.org/drawingml/2006/main">
+              <a:graphicData uri="http://schemas.openxmlformats.org/drawingml/2006/picture">
+                <pic:pic xmlns:pic="http://schemas.openxmlformats.org/drawingml/2006/picture">
+                  <pic:nvPicPr>
+                    <pic:cNvPr id="0" name="" descr=""/>
+                    <pic:cNvPicPr>
+                      <a:picLocks noChangeAspect="1" noChangeArrowheads="1"/>
+                    </pic:cNvPicPr>
+                  </pic:nvPicPr>
+                  <pic:blipFill>
+                    <a:blip r:embed="rId18" cstate="none"/>
                     <a:srcRect/>
                     <a:stretch>
                       <a:fillRect/>

</xml_diff>

<commit_message>
docs: Manual de Usuario con las pantallas y los nombres nuevos, mensajes y Candidatos
</commit_message>
<xml_diff>
--- a/Laburin-Manual-de-Usuario.docx
+++ b/Laburin-Manual-de-Usuario.docx
@@ -132,7 +132,7 @@
         <w:spacing w:after="80"/>
       </w:pPr>
       <w:r>
-        <w:t xml:space="preserve">Ver de un vistazo qué tan afín es cada oferta a tu perfil, gracias a un puntaje de afinidad que vos mismo podés ajustar.</w:t>
+        <w:t xml:space="preserve">Ver de un vistazo qué tan afín es cada oferta a tu perfil, gracias a un puntaje que vos mismo podés ajustar.</w:t>
       </w:r>
     </w:p>
     <w:p>
@@ -145,7 +145,7 @@
         <w:spacing w:after="80"/>
       </w:pPr>
       <w:r>
-        <w:t xml:space="preserve">Seguir el estado de cada postulación en un tablero visual, desde "Por aplicar" hasta "Oferta recibida" o "Rechazado".</w:t>
+        <w:t xml:space="preserve">Seguir el estado de cada postulación en un tablero visual, desde "Por aplicar" hasta "Oferta" o "Rechazado".</w:t>
       </w:r>
     </w:p>
     <w:p>
@@ -171,7 +171,7 @@
         <w:spacing w:after="80"/>
       </w:pPr>
       <w:r>
-        <w:t xml:space="preserve">Recibir un aviso cuando una postulación lleva mucho tiempo sin novedades.</w:t>
+        <w:t xml:space="preserve">Recibir un recordatorio cuando una postulación lleva mucho tiempo sin novedades. Es solo un aviso: no se borra nada.</w:t>
       </w:r>
     </w:p>
     <w:p>
@@ -184,7 +184,28 @@
         <w:spacing w:after="80"/>
       </w:pPr>
       <w:r>
-        <w:t xml:space="preserve">Ver estadísticas de toda tu búsqueda: cuántas postulaciones activas tenés, cómo avanzan, y cuáles son tus mejores fuentes de ofertas.</w:t>
+        <w:t xml:space="preserve">Ver cómo te va en toda tu búsqueda: cuántas postulaciones activas tenés, cómo avanzan y qué fuentes te traen mejores ofertas.</w:t>
+      </w:r>
+    </w:p>
+    <w:p>
+      <w:pPr>
+        <w:pStyle w:val="ListParagraph"/>
+        <w:numPr>
+          <w:ilvl w:val="0"/>
+          <w:numId w:val="2"/>
+        </w:numPr>
+        <w:spacing w:after="80"/>
+      </w:pPr>
+      <w:r>
+        <w:t xml:space="preserve">Recibir mensajes del equipo de Laburin, por ejemplo cuando falta algún dato de tu perfil.</w:t>
+      </w:r>
+    </w:p>
+    <w:p>
+      <w:pPr>
+        <w:spacing w:after="160"/>
+      </w:pPr>
+      <w:r>
+        <w:t xml:space="preserve">Las pantallas principales son: Ofertas, Mis postulaciones, Mi progreso, Mi perfil de búsqueda y Mensajes. Cada una tiene, debajo del título, una línea que explica qué se hace ahí.</w:t>
       </w:r>
     </w:p>
     <w:p>
@@ -193,7 +214,7 @@
         <w:spacing w:after="200" w:before="400"/>
       </w:pPr>
       <w:r>
-        <w:t xml:space="preserve">2. Registro e inicio de sesión</w:t>
+        <w:t xml:space="preserve">2. Registro, inicio de sesión y contraseña</w:t>
       </w:r>
     </w:p>
     <w:p>
@@ -218,23 +239,15 @@
         <w:spacing w:after="160"/>
       </w:pPr>
       <w:r>
-        <w:t xml:space="preserve">En la pantalla de inicio, hacé clic en "¿No tenés cuenta? Registrate". Completá tu email y elegí una contraseña.</w:t>
-      </w:r>
-    </w:p>
-    <w:p>
-      <w:pPr>
-        <w:spacing w:after="160"/>
-      </w:pPr>
-      <w:r>
-        <w:t xml:space="preserve">Mientras escribís la contraseña, vas a ver un indicador que te muestra qué tan segura es (débil, media o fuerte). Usar una contraseña fuerte, con mayúsculas, números y algún símbolo, ayuda a proteger tu cuenta.</w:t>
-      </w:r>
-    </w:p>
-    <w:p>
-      <w:pPr>
-        <w:spacing w:after="160"/>
-      </w:pPr>
-      <w:r>
-        <w:t xml:space="preserve">Podés tocar el ícono del ojo, al lado del campo de contraseña, para mostrarla u ocultarla mientras la escribís y así confirmar que no te equivocaste.</w:t>
+        <w:t xml:space="preserve">En la pantalla de inicio, hacé clic en "¿No tenés cuenta? Registrate". Completá tu email y elegí una contraseña de al menos 8 caracteres.</w:t>
+      </w:r>
+    </w:p>
+    <w:p>
+      <w:pPr>
+        <w:spacing w:after="160"/>
+      </w:pPr>
+      <w:r>
+        <w:t xml:space="preserve">Mientras escribís la contraseña, vas a ver un indicador que te muestra qué tan segura es (débil, media o fuerte). Usar una contraseña fuerte, con mayúsculas, números y algún símbolo, ayuda a proteger tu cuenta. Podés tocar el ícono del ojo, al lado del campo, para mostrarla u ocultarla mientras la escribís.</w:t>
       </w:r>
     </w:p>
     <w:p>
@@ -251,7 +264,7 @@
       <w:r>
         <w:drawing>
           <wp:inline distT="0" distB="0" distL="0" distR="0">
-            <wp:extent cx="5524500" cy="3886200"/>
+            <wp:extent cx="5334000" cy="4286250"/>
             <wp:effectExtent t="0" r="0" b="0" l="0"/>
             <wp:docPr id="1" name="" descr="" title=""/>
             <wp:cNvGraphicFramePr>
@@ -276,7 +289,7 @@
                   <pic:spPr bwMode="auto">
                     <a:xfrm>
                       <a:off x="0" y="0"/>
-                      <a:ext cx="5524500" cy="3886200"/>
+                      <a:ext cx="5334000" cy="4286250"/>
                     </a:xfrm>
                     <a:prstGeom prst="rect">
                       <a:avLst/>
@@ -311,92 +324,23 @@
         <w:spacing w:after="140" w:before="280"/>
       </w:pPr>
       <w:r>
-        <w:t xml:space="preserve">Iniciar sesión</w:t>
-      </w:r>
-    </w:p>
-    <w:p>
-      <w:pPr>
-        <w:spacing w:after="160"/>
-      </w:pPr>
-      <w:r>
-        <w:t xml:space="preserve">Si ya tenés cuenta, ingresá tu email y contraseña en la pantalla de inicio y hacé clic en "Ingresar". Laburin va a recordar tu sesión, así que no vas a tener que volver a loguearte cada vez que abras la aplicación en el mismo dispositivo.</w:t>
-      </w:r>
-    </w:p>
-    <w:p>
-      <w:pPr>
-        <w:pStyle w:val="Heading1"/>
-        <w:spacing w:after="200" w:before="400"/>
-      </w:pPr>
-      <w:r>
-        <w:t xml:space="preserve">3. Onboarding</w:t>
-      </w:r>
-    </w:p>
-    <w:p>
-      <w:pPr>
-        <w:spacing w:after="160"/>
-      </w:pPr>
-      <w:r>
-        <w:t xml:space="preserve">La primera vez que entrás a Laburin, antes de ver tus ofertas, te vamos a hacer algunas preguntas rápidas sobre tu búsqueda. Esto sirve para calcular, desde el primer momento, qué tan afín es cada oferta a lo que estás buscando.</w:t>
-      </w:r>
-    </w:p>
-    <w:p>
-      <w:pPr>
-        <w:spacing w:after="160"/>
-      </w:pPr>
-      <w:r>
-        <w:t xml:space="preserve">El onboarding tiene varios pasos cortos:</w:t>
-      </w:r>
-    </w:p>
-    <w:p>
-      <w:pPr>
-        <w:pStyle w:val="ListParagraph"/>
-        <w:numPr>
-          <w:ilvl w:val="0"/>
-          <w:numId w:val="3"/>
-        </w:numPr>
-        <w:spacing w:after="80"/>
-      </w:pPr>
-      <w:r>
-        <w:t xml:space="preserve">Rol buscado: qué puesto estás buscando (por ejemplo, "QA Automation" o "Frontend Developer").</w:t>
-      </w:r>
-    </w:p>
-    <w:p>
-      <w:pPr>
-        <w:pStyle w:val="ListParagraph"/>
-        <w:numPr>
-          <w:ilvl w:val="0"/>
-          <w:numId w:val="3"/>
-        </w:numPr>
-        <w:spacing w:after="80"/>
-      </w:pPr>
-      <w:r>
-        <w:t xml:space="preserve">Tecnologías: qué tecnologías te interesan o manejás.</w:t>
-      </w:r>
-    </w:p>
-    <w:p>
-      <w:pPr>
-        <w:pStyle w:val="ListParagraph"/>
-        <w:numPr>
-          <w:ilvl w:val="0"/>
-          <w:numId w:val="3"/>
-        </w:numPr>
-        <w:spacing w:after="80"/>
-      </w:pPr>
-      <w:r>
-        <w:t xml:space="preserve">Modalidad y ubicación: remoto, híbrido o presencial, y en qué ciudad buscás.</w:t>
-      </w:r>
-    </w:p>
-    <w:p>
-      <w:pPr>
-        <w:pStyle w:val="ListParagraph"/>
-        <w:numPr>
-          <w:ilvl w:val="0"/>
-          <w:numId w:val="3"/>
-        </w:numPr>
-        <w:spacing w:after="80"/>
-      </w:pPr>
-      <w:r>
-        <w:t xml:space="preserve">Nivel de experiencia: junior, semi senior o senior.</w:t>
+        <w:t xml:space="preserve">Si algo está mal, te lo decimos en español</w:t>
+      </w:r>
+    </w:p>
+    <w:p>
+      <w:pPr>
+        <w:spacing w:after="160"/>
+      </w:pPr>
+      <w:r>
+        <w:t xml:space="preserve">Laburin revisa lo que escribís antes de enviarlo y te avisa junto al campo qué corregir: por ejemplo, "Escribí un email válido, por ejemplo nombre@correo.com" si falta la arroba, o "Escribí tu contraseña." si la dejaste vacía.</w:t>
+      </w:r>
+    </w:p>
+    <w:p>
+      <w:pPr>
+        <w:spacing w:after="160"/>
+      </w:pPr>
+      <w:r>
+        <w:t xml:space="preserve">Si el email y la contraseña no coinciden, el mensaje es "El email y la contraseña no coinciden. Revisalos o recuperá tu contraseña." Por seguridad, no te decimos cuál de los dos datos es el incorrecto. Si intentás registrarte con un email que ya tiene cuenta, te lo avisamos y te ofrecemos iniciar sesión o recuperar tu contraseña.</w:t>
       </w:r>
     </w:p>
     <w:p>
@@ -413,7 +357,7 @@
       <w:r>
         <w:drawing>
           <wp:inline distT="0" distB="0" distL="0" distR="0">
-            <wp:extent cx="5524500" cy="3886200"/>
+            <wp:extent cx="5715000" cy="3209925"/>
             <wp:effectExtent t="0" r="0" b="0" l="0"/>
             <wp:docPr id="2" name="" descr="" title=""/>
             <wp:cNvGraphicFramePr>
@@ -438,7 +382,7 @@
                   <pic:spPr bwMode="auto">
                     <a:xfrm>
                       <a:off x="0" y="0"/>
-                      <a:ext cx="5524500" cy="3886200"/>
+                      <a:ext cx="5715000" cy="3209925"/>
                     </a:xfrm>
                     <a:prstGeom prst="rect">
                       <a:avLst/>
@@ -464,7 +408,49 @@
           <w:sz w:val="18"/>
           <w:szCs w:val="18"/>
         </w:rPr>
-        <w:t xml:space="preserve">Primer paso del onboarding: el rol que estás buscando.</w:t>
+        <w:t xml:space="preserve">Los errores se explican junto a cada campo, siempre en español.</w:t>
+      </w:r>
+    </w:p>
+    <w:p>
+      <w:pPr>
+        <w:pStyle w:val="Heading2"/>
+        <w:spacing w:after="140" w:before="280"/>
+      </w:pPr>
+      <w:r>
+        <w:t xml:space="preserve">Iniciar sesión</w:t>
+      </w:r>
+    </w:p>
+    <w:p>
+      <w:pPr>
+        <w:spacing w:after="160"/>
+      </w:pPr>
+      <w:r>
+        <w:t xml:space="preserve">Si ya tenés cuenta, ingresá tu email y contraseña y hacé clic en "Ingresar". Laburin recuerda tu sesión, así que no vas a tener que volver a loguearte cada vez que abras la aplicación en el mismo dispositivo.</w:t>
+      </w:r>
+    </w:p>
+    <w:p>
+      <w:pPr>
+        <w:pStyle w:val="Heading2"/>
+        <w:spacing w:after="140" w:before="280"/>
+      </w:pPr>
+      <w:r>
+        <w:t xml:space="preserve">Olvidé mi contraseña</w:t>
+      </w:r>
+    </w:p>
+    <w:p>
+      <w:pPr>
+        <w:spacing w:after="160"/>
+      </w:pPr>
+      <w:r>
+        <w:t xml:space="preserve">En la pantalla de inicio, tocá "¿Olvidaste tu contraseña?", escribí tu email y apretá "Enviar enlace". Te vamos a mostrar el mensaje "Si el email existe, te enviamos un enlace para cambiar tu contraseña", y es el mismo exista o no una cuenta con ese email. Revisá tu bandeja de entrada y la carpeta de spam.</w:t>
+      </w:r>
+    </w:p>
+    <w:p>
+      <w:pPr>
+        <w:spacing w:after="160"/>
+      </w:pPr>
+      <w:r>
+        <w:t xml:space="preserve">Podés pedir un enlace nuevo recién pasado un minuto. Al abrir el enlace del mail elegís una contraseña nueva (con la misma validación y el mismo indicador de fortaleza que en el registro) y volvés a la aplicación. Si el enlace venció o ya se usó, la pantalla te lo explica y te deja pedir otro.</w:t>
       </w:r>
     </w:p>
     <w:p>
@@ -481,7 +467,7 @@
       <w:r>
         <w:drawing>
           <wp:inline distT="0" distB="0" distL="0" distR="0">
-            <wp:extent cx="5524500" cy="3886200"/>
+            <wp:extent cx="5715000" cy="3209925"/>
             <wp:effectExtent t="0" r="0" b="0" l="0"/>
             <wp:docPr id="3" name="" descr="" title=""/>
             <wp:cNvGraphicFramePr>
@@ -506,7 +492,7 @@
                   <pic:spPr bwMode="auto">
                     <a:xfrm>
                       <a:off x="0" y="0"/>
-                      <a:ext cx="5524500" cy="3886200"/>
+                      <a:ext cx="5715000" cy="3209925"/>
                     </a:xfrm>
                     <a:prstGeom prst="rect">
                       <a:avLst/>
@@ -532,23 +518,7 @@
           <w:sz w:val="18"/>
           <w:szCs w:val="18"/>
         </w:rPr>
-        <w:t xml:space="preserve">Selección de tecnologías de interés, con opción de agregar otras.</w:t>
-      </w:r>
-    </w:p>
-    <w:p>
-      <w:pPr>
-        <w:spacing w:after="160"/>
-      </w:pPr>
-      <w:r>
-        <w:t xml:space="preserve">Cada respuesta que des acá se convierte, automáticamente, en un criterio de afinidad: Laburin le va a sumar puntos a las ofertas que mencionen tu rol, tus tecnologías, tu modalidad preferida, etc. No te preocupes si no queda exactamente como buscás — más adelante, en Configuración, vas a poder ajustar, agregar o quitar estos criterios cuando quieras.</w:t>
-      </w:r>
-    </w:p>
-    <w:p>
-      <w:pPr>
-        <w:spacing w:after="160"/>
-      </w:pPr>
-      <w:r>
-        <w:t xml:space="preserve">Si no querés completar el onboarding en este momento, podés tocar "Omitir por ahora" en cualquier paso. Vas a poder cargar esta información más adelante desde Configuración.</w:t>
+        <w:t xml:space="preserve">Recuperar la contraseña: el mensaje es neutro, exista o no la cuenta.</w:t>
       </w:r>
     </w:p>
     <w:p>
@@ -557,15 +527,88 @@
         <w:spacing w:after="200" w:before="400"/>
       </w:pPr>
       <w:r>
-        <w:t xml:space="preserve">4. Ofertas</w:t>
-      </w:r>
-    </w:p>
-    <w:p>
-      <w:pPr>
-        <w:spacing w:after="160"/>
-      </w:pPr>
-      <w:r>
-        <w:t xml:space="preserve">La sección "Ofertas" es donde ves todas las ofertas de trabajo que guardaste, con su puntaje de afinidad calculado automáticamente.</w:t>
+        <w:t xml:space="preserve">3. Configuración inicial de tu perfil</w:t>
+      </w:r>
+    </w:p>
+    <w:p>
+      <w:pPr>
+        <w:spacing w:after="160"/>
+      </w:pPr>
+      <w:r>
+        <w:t xml:space="preserve">La primera vez que entrás a Laburin, antes de ver tus ofertas, te hacemos algunas preguntas cortas sobre tu búsqueda, de a una por vez y con el botón "Continuar". Esto sirve para calcular, desde el primer momento, qué tan afín es cada oferta a lo que estás buscando. Arriba de cada paso ves en cuál estás ("Paso 2 de 5").</w:t>
+      </w:r>
+    </w:p>
+    <w:p>
+      <w:pPr>
+        <w:pStyle w:val="ListParagraph"/>
+        <w:numPr>
+          <w:ilvl w:val="0"/>
+          <w:numId w:val="3"/>
+        </w:numPr>
+        <w:spacing w:after="80"/>
+      </w:pPr>
+      <w:r>
+        <w:t xml:space="preserve">Tu nombre y el rol que buscás (por ejemplo, "QA Automation" o "Frontend Developer"). Junto al nombre ves un aviso de qué datos puede ver el equipo de Laburin (ver la sección 11).</w:t>
+      </w:r>
+    </w:p>
+    <w:p>
+      <w:pPr>
+        <w:pStyle w:val="ListParagraph"/>
+        <w:numPr>
+          <w:ilvl w:val="0"/>
+          <w:numId w:val="3"/>
+        </w:numPr>
+        <w:spacing w:after="80"/>
+      </w:pPr>
+      <w:r>
+        <w:t xml:space="preserve">Tecnologías: elegí las que te interesen, o escribí otras. Las que elegís se muestran en una lista, "Tus tecnologías", y cada una se quita con la ✕. Si escribiste una tecnología y te olvidaste de apretar "Agregar", la sumamos sola cuando tocás "Continuar". "SQL" y "sql" cuentan como la misma.</w:t>
+      </w:r>
+    </w:p>
+    <w:p>
+      <w:pPr>
+        <w:pStyle w:val="ListParagraph"/>
+        <w:numPr>
+          <w:ilvl w:val="0"/>
+          <w:numId w:val="3"/>
+        </w:numPr>
+        <w:spacing w:after="80"/>
+      </w:pPr>
+      <w:r>
+        <w:t xml:space="preserve">Modalidad y ubicación: remoto, híbrido o presencial, y en qué ciudad o país buscás.</w:t>
+      </w:r>
+    </w:p>
+    <w:p>
+      <w:pPr>
+        <w:pStyle w:val="ListParagraph"/>
+        <w:numPr>
+          <w:ilvl w:val="0"/>
+          <w:numId w:val="3"/>
+        </w:numPr>
+        <w:spacing w:after="80"/>
+      </w:pPr>
+      <w:r>
+        <w:t xml:space="preserve">Nivel de experiencia: junior, semi senior o senior. Este paso es opcional.</w:t>
+      </w:r>
+    </w:p>
+    <w:p>
+      <w:pPr>
+        <w:pStyle w:val="ListParagraph"/>
+        <w:numPr>
+          <w:ilvl w:val="0"/>
+          <w:numId w:val="3"/>
+        </w:numPr>
+        <w:spacing w:after="80"/>
+      </w:pPr>
+      <w:r>
+        <w:t xml:space="preserve">Revisá tus datos: un resumen de todo lo que cargaste, que podés corregir ahí mismo antes de terminar.</w:t>
+      </w:r>
+    </w:p>
+    <w:p>
+      <w:pPr>
+        <w:spacing w:after="160"/>
+      </w:pPr>
+      <w:r>
+        <w:t xml:space="preserve">En cada paso, si falta un dato obligatorio, el mensaje aparece junto al campo (por ejemplo, "Elegí o escribí al menos una tecnología.") y no podés avanzar hasta completarlo.</w:t>
       </w:r>
     </w:p>
     <w:p>
@@ -582,7 +625,7 @@
       <w:r>
         <w:drawing>
           <wp:inline distT="0" distB="0" distL="0" distR="0">
-            <wp:extent cx="5715000" cy="3209925"/>
+            <wp:extent cx="3143250" cy="2686050"/>
             <wp:effectExtent t="0" r="0" b="0" l="0"/>
             <wp:docPr id="4" name="" descr="" title=""/>
             <wp:cNvGraphicFramePr>
@@ -607,7 +650,7 @@
                   <pic:spPr bwMode="auto">
                     <a:xfrm>
                       <a:off x="0" y="0"/>
-                      <a:ext cx="5715000" cy="3209925"/>
+                      <a:ext cx="3143250" cy="2686050"/>
                     </a:xfrm>
                     <a:prstGeom prst="rect">
                       <a:avLst/>
@@ -633,49 +676,7 @@
           <w:sz w:val="18"/>
           <w:szCs w:val="18"/>
         </w:rPr>
-        <w:t xml:space="preserve">Listado de ofertas, con el puntaje de afinidad de cada una.</w:t>
-      </w:r>
-    </w:p>
-    <w:p>
-      <w:pPr>
-        <w:pStyle w:val="Heading2"/>
-        <w:spacing w:after="140" w:before="280"/>
-      </w:pPr>
-      <w:r>
-        <w:t xml:space="preserve">Ver y filtrar ofertas</w:t>
-      </w:r>
-    </w:p>
-    <w:p>
-      <w:pPr>
-        <w:spacing w:after="160"/>
-      </w:pPr>
-      <w:r>
-        <w:t xml:space="preserve">Cada oferta se muestra en una tarjeta con la empresa, el puesto, la modalidad, las tecnologías mencionadas y, en un círculo de color, el puntaje de afinidad: cuanto más alto, mejor encaja con tu perfil.</w:t>
-      </w:r>
-    </w:p>
-    <w:p>
-      <w:pPr>
-        <w:spacing w:after="160"/>
-      </w:pPr>
-      <w:r>
-        <w:t xml:space="preserve">Arriba de la lista podés filtrar por fuente (de dónde salió la oferta), por ubicación, y por puntaje mínimo, para encontrar rápido las que más te interesan. Los filtros se aplican sobre todas tus ofertas, no solo sobre las que ves en pantalla.</w:t>
-      </w:r>
-    </w:p>
-    <w:p>
-      <w:pPr>
-        <w:pStyle w:val="Heading2"/>
-        <w:spacing w:after="140" w:before="280"/>
-      </w:pPr>
-      <w:r>
-        <w:t xml:space="preserve">Moverte entre páginas</w:t>
-      </w:r>
-    </w:p>
-    <w:p>
-      <w:pPr>
-        <w:spacing w:after="160"/>
-      </w:pPr>
-      <w:r>
-        <w:t xml:space="preserve">Las ofertas se muestran de a 30 por página. Al final de la lista vas a ver cuántas ofertas tenés en total (con los filtros que estés usando) y en qué página estás, por ejemplo "34 ofertas · Página 1 de 2", junto con los botones "Anterior" y "Siguiente" para pasar de una página a otra.</w:t>
+        <w:t xml:space="preserve">Paso 1: tu nombre, el rol que buscás y el aviso de privacidad.</w:t>
       </w:r>
     </w:p>
     <w:p>
@@ -692,7 +693,7 @@
       <w:r>
         <w:drawing>
           <wp:inline distT="0" distB="0" distL="0" distR="0">
-            <wp:extent cx="5715000" cy="3209925"/>
+            <wp:extent cx="3143250" cy="2686050"/>
             <wp:effectExtent t="0" r="0" b="0" l="0"/>
             <wp:docPr id="5" name="" descr="" title=""/>
             <wp:cNvGraphicFramePr>
@@ -717,7 +718,7 @@
                   <pic:spPr bwMode="auto">
                     <a:xfrm>
                       <a:off x="0" y="0"/>
-                      <a:ext cx="5715000" cy="3209925"/>
+                      <a:ext cx="3143250" cy="2686050"/>
                     </a:xfrm>
                     <a:prstGeom prst="rect">
                       <a:avLst/>
@@ -743,24 +744,7 @@
           <w:sz w:val="18"/>
           <w:szCs w:val="18"/>
         </w:rPr>
-        <w:t xml:space="preserve">Al final del listado: el total de ofertas, la página actual y los botones para cambiar de página.</w:t>
-      </w:r>
-    </w:p>
-    <w:p>
-      <w:pPr>
-        <w:pStyle w:val="Heading2"/>
-        <w:spacing w:after="140" w:before="280"/>
-      </w:pPr>
-      <w:r>
-        <w:t xml:space="preserve">Importar ofertas automáticamente</w:t>
-      </w:r>
-    </w:p>
-    <w:p>
-      <w:pPr>
-        <w:spacing w:after="160"/>
-      </w:pPr>
-      <w:r>
-        <w:t xml:space="preserve">Tocando "Importar ofertas remotas", Laburin busca ofertas nuevas publicadas en portales de empleo remoto y las agrega a tu lista, calculando el puntaje de cada una según tus criterios. Si una oferta ya la tenías cargada, Laburin no la duplica: te va a avisar cuántas se importaron y cuántas se omitieron por estar repetidas.</w:t>
+        <w:t xml:space="preserve">Paso 2: tecnologías elegidas, con opción de quitar cada una.</w:t>
       </w:r>
     </w:p>
     <w:p>
@@ -777,7 +761,7 @@
       <w:r>
         <w:drawing>
           <wp:inline distT="0" distB="0" distL="0" distR="0">
-            <wp:extent cx="5715000" cy="3209925"/>
+            <wp:extent cx="2381250" cy="4876800"/>
             <wp:effectExtent t="0" r="0" b="0" l="0"/>
             <wp:docPr id="6" name="" descr="" title=""/>
             <wp:cNvGraphicFramePr>
@@ -802,7 +786,7 @@
                   <pic:spPr bwMode="auto">
                     <a:xfrm>
                       <a:off x="0" y="0"/>
-                      <a:ext cx="5715000" cy="3209925"/>
+                      <a:ext cx="2381250" cy="4876800"/>
                     </a:xfrm>
                     <a:prstGeom prst="rect">
                       <a:avLst/>
@@ -828,83 +812,15 @@
           <w:sz w:val="18"/>
           <w:szCs w:val="18"/>
         </w:rPr>
-        <w:t xml:space="preserve">Resultado de una importación: cuántas ofertas nuevas entraron y cuántas se omitieron por duplicadas.</w:t>
-      </w:r>
-    </w:p>
-    <w:p>
-      <w:pPr>
-        <w:pStyle w:val="Heading2"/>
-        <w:spacing w:after="140" w:before="280"/>
-      </w:pPr>
-      <w:r>
-        <w:t xml:space="preserve">Cargar una oferta manualmente</w:t>
-      </w:r>
-    </w:p>
-    <w:p>
-      <w:pPr>
-        <w:spacing w:after="160"/>
-      </w:pPr>
-      <w:r>
-        <w:t xml:space="preserve">Si encontraste una oferta por tu cuenta (en LinkedIn, en la web de una empresa, por referencia de alguien), podés cargarla vos mismo con "Nueva oferta", completando empresa, puesto, modalidad, ubicación y tecnologías.</w:t>
-      </w:r>
-    </w:p>
-    <w:p>
-      <w:pPr>
-        <w:pStyle w:val="Heading2"/>
-        <w:spacing w:after="140" w:before="280"/>
-      </w:pPr>
-      <w:r>
-        <w:t xml:space="preserve">Editar o borrar una oferta</w:t>
-      </w:r>
-    </w:p>
-    <w:p>
-      <w:pPr>
-        <w:spacing w:after="160"/>
-      </w:pPr>
-      <w:r>
-        <w:t xml:space="preserve">Desde la tarjeta de cada oferta podés editarla (ícono de lápiz) o borrarla (ícono de tacho) individualmente.</w:t>
-      </w:r>
-    </w:p>
-    <w:p>
-      <w:pPr>
-        <w:spacing w:after="160"/>
-      </w:pPr>
-      <w:r>
-        <w:t xml:space="preserve">Si querés borrar varias a la vez, marcá las casillas de las ofertas que querés eliminar y usá "Eliminar seleccionadas" en la barra que aparece arriba de la lista. La casilla "Seleccionar esta página" marca las ofertas que estás viendo; si tenés más de una página, aparece además el enlace "Seleccionar las N ofertas que coinciden", que marca todas las que cumplen los filtros que estás usando, estén en la página que estén. El botón "Eliminar seleccionadas" siempre te dice cuántas vas a borrar, y antes de hacerlo Laburin te pide confirmación.</w:t>
-      </w:r>
-    </w:p>
-    <w:p>
-      <w:pPr>
-        <w:pStyle w:val="Heading2"/>
-        <w:spacing w:after="140" w:before="280"/>
-      </w:pPr>
-      <w:r>
-        <w:t xml:space="preserve">Postularte</w:t>
-      </w:r>
-    </w:p>
-    <w:p>
-      <w:pPr>
-        <w:spacing w:after="160"/>
-      </w:pPr>
-      <w:r>
-        <w:t xml:space="preserve">Cuando encontrás una oferta a la que querés postularte, tocá "Postularme". Esto la va a mover al Tablero, en la columna "Por aplicar", para que empieces a hacerle seguimiento.</w:t>
-      </w:r>
-    </w:p>
-    <w:p>
-      <w:pPr>
-        <w:pStyle w:val="Heading1"/>
-        <w:spacing w:after="200" w:before="400"/>
-      </w:pPr>
-      <w:r>
-        <w:t xml:space="preserve">5. Tablero Kanban</w:t>
-      </w:r>
-    </w:p>
-    <w:p>
-      <w:pPr>
-        <w:spacing w:after="160"/>
-      </w:pPr>
-      <w:r>
-        <w:t xml:space="preserve">El Tablero es donde seguís el estado de cada postulación, desde que decidís postularte hasta que termina el proceso.</w:t>
+        <w:t xml:space="preserve">Paso 5: resumen editable. Dice dónde se guardan tus datos: podés cambiarlos cuando quieras en Mi perfil de búsqueda.</w:t>
+      </w:r>
+    </w:p>
+    <w:p>
+      <w:pPr>
+        <w:spacing w:after="160"/>
+      </w:pPr>
+      <w:r>
+        <w:t xml:space="preserve">Al terminar ves una pantalla de confirmación, "Tu perfil quedó listo", y recibís un mensaje de bienvenida en la sección Mensajes. Cada respuesta se convierte en un criterio de afinidad: Laburin le suma puntos a las ofertas que mencionan tu rol, tus tecnologías, tu modalidad y tu ubicación. Más adelante, en Mi perfil de búsqueda, podés ajustar, agregar o quitar estos criterios cuando quieras.</w:t>
       </w:r>
     </w:p>
     <w:p>
@@ -921,7 +837,7 @@
       <w:r>
         <w:drawing>
           <wp:inline distT="0" distB="0" distL="0" distR="0">
-            <wp:extent cx="5715000" cy="3209925"/>
+            <wp:extent cx="3619500" cy="2047875"/>
             <wp:effectExtent t="0" r="0" b="0" l="0"/>
             <wp:docPr id="7" name="" descr="" title=""/>
             <wp:cNvGraphicFramePr>
@@ -946,7 +862,7 @@
                   <pic:spPr bwMode="auto">
                     <a:xfrm>
                       <a:off x="0" y="0"/>
-                      <a:ext cx="5715000" cy="3209925"/>
+                      <a:ext cx="3619500" cy="2047875"/>
                     </a:xfrm>
                     <a:prstGeom prst="rect">
                       <a:avLst/>
@@ -972,15 +888,32 @@
           <w:sz w:val="18"/>
           <w:szCs w:val="18"/>
         </w:rPr>
-        <w:t xml:space="preserve">Tablero Kanban en computadora, con las seis columnas del proceso.</w:t>
-      </w:r>
-    </w:p>
-    <w:p>
-      <w:pPr>
-        <w:spacing w:after="160"/>
-      </w:pPr>
-      <w:r>
-        <w:t xml:space="preserve">Tiene seis columnas: Por aplicar, Aplicado, En proceso, Entrevista, Oferta y Rechazado. Cada postulación es una tarjeta que vas moviendo de columna a medida que avanza el proceso.</w:t>
+        <w:t xml:space="preserve">Confirmación al terminar la configuración inicial.</w:t>
+      </w:r>
+    </w:p>
+    <w:p>
+      <w:pPr>
+        <w:spacing w:after="160"/>
+      </w:pPr>
+      <w:r>
+        <w:t xml:space="preserve">Si no querés completar la configuración en este momento, podés tocar "Omitir por ahora". En ese caso Laburin te recuerda, en Ofertas y en "Primeros pasos", que todavía no armaste tu perfil de búsqueda, y podés completarlo cuando quieras desde Mi perfil de búsqueda.</w:t>
+      </w:r>
+    </w:p>
+    <w:p>
+      <w:pPr>
+        <w:pStyle w:val="Heading1"/>
+        <w:spacing w:after="200" w:before="400"/>
+      </w:pPr>
+      <w:r>
+        <w:t xml:space="preserve">4. Ofertas</w:t>
+      </w:r>
+    </w:p>
+    <w:p>
+      <w:pPr>
+        <w:spacing w:after="160"/>
+      </w:pPr>
+      <w:r>
+        <w:t xml:space="preserve">La sección "Ofertas" es donde ves todas las ofertas de trabajo que guardaste, con su puntaje calculado automáticamente según tu perfil de búsqueda.</w:t>
       </w:r>
     </w:p>
     <w:p>
@@ -989,32 +922,23 @@
         <w:spacing w:after="140" w:before="280"/>
       </w:pPr>
       <w:r>
-        <w:t xml:space="preserve">En computadora</w:t>
-      </w:r>
-    </w:p>
-    <w:p>
-      <w:pPr>
-        <w:spacing w:after="160"/>
-      </w:pPr>
-      <w:r>
-        <w:t xml:space="preserve">Podés arrastrar la tarjeta de una columna a otra con el mouse: hacé clic, mantené presionado y soltá en la columna que corresponda.</w:t>
-      </w:r>
-    </w:p>
-    <w:p>
-      <w:pPr>
-        <w:pStyle w:val="Heading2"/>
-        <w:spacing w:after="140" w:before="280"/>
-      </w:pPr>
-      <w:r>
-        <w:t xml:space="preserve">En el celular</w:t>
-      </w:r>
-    </w:p>
-    <w:p>
-      <w:pPr>
-        <w:spacing w:after="160"/>
-      </w:pPr>
-      <w:r>
-        <w:t xml:space="preserve">Como arrastrar con el dedo en una pantalla chica puede ser poco preciso, en el celular cada tarjeta tiene un selector "Mover a...": tocás la tarjeta, elegís la columna de destino en la lista, y listo.</w:t>
+        <w:t xml:space="preserve">Primeros pasos</w:t>
+      </w:r>
+    </w:p>
+    <w:p>
+      <w:pPr>
+        <w:spacing w:after="160"/>
+      </w:pPr>
+      <w:r>
+        <w:t xml:space="preserve">Mientras no tengas ninguna postulación, arriba de Ofertas y de Mis postulaciones ves una tarjeta "Primeros pasos" con cuatro pasos: revisá tu perfil de búsqueda, importá o cargá ofertas, postulate a una y seguí su avance en Mis postulaciones. Cada paso tiene un enlace que te lleva ahí. Si todavía no armaste tu perfil, ese paso aparece destacado como "Pendiente". Podés cerrar la tarjeta con la ✕ y Laburin recuerda que la cerraste.</w:t>
+      </w:r>
+    </w:p>
+    <w:p>
+      <w:pPr>
+        <w:spacing w:after="160"/>
+      </w:pPr>
+      <w:r>
+        <w:t xml:space="preserve">Si todavía no hay ofertas cargadas, la pantalla te lo dice y te ofrece dos botones: importar ofertas remotas o cargar una a mano.</w:t>
       </w:r>
     </w:p>
     <w:p>
@@ -1031,7 +955,7 @@
       <w:r>
         <w:drawing>
           <wp:inline distT="0" distB="0" distL="0" distR="0">
-            <wp:extent cx="2190750" cy="4724400"/>
+            <wp:extent cx="5715000" cy="3209925"/>
             <wp:effectExtent t="0" r="0" b="0" l="0"/>
             <wp:docPr id="8" name="" descr="" title=""/>
             <wp:cNvGraphicFramePr>
@@ -1056,7 +980,7 @@
                   <pic:spPr bwMode="auto">
                     <a:xfrm>
                       <a:off x="0" y="0"/>
-                      <a:ext cx="2190750" cy="4724400"/>
+                      <a:ext cx="5715000" cy="3209925"/>
                     </a:xfrm>
                     <a:prstGeom prst="rect">
                       <a:avLst/>
@@ -1082,32 +1006,7 @@
           <w:sz w:val="18"/>
           <w:szCs w:val="18"/>
         </w:rPr>
-        <w:t xml:space="preserve">En el celular, un selector reemplaza al arrastre para cambiar de columna.</w:t>
-      </w:r>
-    </w:p>
-    <w:p>
-      <w:pPr>
-        <w:spacing w:after="160"/>
-      </w:pPr>
-      <w:r>
-        <w:t xml:space="preserve">Laburin guarda el historial de cada cambio de estado, así que siempre queda registro de cuándo pasó cada postulación de una etapa a otra.</w:t>
-      </w:r>
-    </w:p>
-    <w:p>
-      <w:pPr>
-        <w:pStyle w:val="Heading1"/>
-        <w:spacing w:after="200" w:before="400"/>
-      </w:pPr>
-      <w:r>
-        <w:t xml:space="preserve">6. Ficha de Postulación</w:t>
-      </w:r>
-    </w:p>
-    <w:p>
-      <w:pPr>
-        <w:spacing w:after="160"/>
-      </w:pPr>
-      <w:r>
-        <w:t xml:space="preserve">Si tocás una tarjeta del Tablero, se abre la Ficha de esa postulación, con todos los detalles de la oferta y una línea de tiempo con cada contacto que tuviste con la empresa.</w:t>
+        <w:t xml:space="preserve">Sin ofertas cargadas: la pantalla explica qué hacer y ofrece los botones para empezar.</w:t>
       </w:r>
     </w:p>
     <w:p>
@@ -1175,7 +1074,7 @@
           <w:sz w:val="18"/>
           <w:szCs w:val="18"/>
         </w:rPr>
-        <w:t xml:space="preserve">Ficha de una postulación, con el timeline de interacciones registradas.</w:t>
+        <w:t xml:space="preserve">Listado de ofertas, con "Primeros pasos", los filtros y el puntaje de cada oferta.</w:t>
       </w:r>
     </w:p>
     <w:p>
@@ -1184,57 +1083,57 @@
         <w:spacing w:after="140" w:before="280"/>
       </w:pPr>
       <w:r>
-        <w:t xml:space="preserve">Agregar una interacción</w:t>
-      </w:r>
-    </w:p>
-    <w:p>
-      <w:pPr>
-        <w:spacing w:after="160"/>
-      </w:pPr>
-      <w:r>
-        <w:t xml:space="preserve">Cada vez que tengas novedades (te mandaron un mail, te llamaron, tuviste una entrevista), podés registrarlo como una interacción: elegís el tipo, la fecha, y podés agregar una nota con el detalle.</w:t>
-      </w:r>
-    </w:p>
-    <w:p>
-      <w:pPr>
-        <w:spacing w:after="160"/>
-      </w:pPr>
-      <w:r>
-        <w:t xml:space="preserve">Esto te sirve para no perder el hilo de en qué quedó cada proceso, sobre todo cuando tenés varias postulaciones activas al mismo tiempo.</w:t>
-      </w:r>
-    </w:p>
-    <w:p>
-      <w:pPr>
-        <w:pStyle w:val="Heading2"/>
-        <w:spacing w:after="140" w:before="280"/>
-      </w:pPr>
-      <w:r>
-        <w:t xml:space="preserve">Borrar una interacción</w:t>
-      </w:r>
-    </w:p>
-    <w:p>
-      <w:pPr>
-        <w:spacing w:after="160"/>
-      </w:pPr>
-      <w:r>
-        <w:t xml:space="preserve">Si cargaste una interacción por error, podés borrarla desde la misma línea de tiempo.</w:t>
-      </w:r>
-    </w:p>
-    <w:p>
-      <w:pPr>
-        <w:pStyle w:val="Heading1"/>
-        <w:spacing w:after="200" w:before="400"/>
-      </w:pPr>
-      <w:r>
-        <w:t xml:space="preserve">7. Configuración del motor de scoring</w:t>
-      </w:r>
-    </w:p>
-    <w:p>
-      <w:pPr>
-        <w:spacing w:after="160"/>
-      </w:pPr>
-      <w:r>
-        <w:t xml:space="preserve">En "Configuración" definís las reglas que Laburin usa para calcular el puntaje de afinidad de cada oferta.</w:t>
+        <w:t xml:space="preserve">Ver y filtrar ofertas</w:t>
+      </w:r>
+    </w:p>
+    <w:p>
+      <w:pPr>
+        <w:spacing w:after="160"/>
+      </w:pPr>
+      <w:r>
+        <w:t xml:space="preserve">Cada oferta se muestra en una tarjeta con la empresa, el puesto, la modalidad, las tecnologías mencionadas y, en un círculo de color, el puntaje: cuanto más alto, mejor encaja con tu perfil.</w:t>
+      </w:r>
+    </w:p>
+    <w:p>
+      <w:pPr>
+        <w:spacing w:after="160"/>
+      </w:pPr>
+      <w:r>
+        <w:t xml:space="preserve">Arriba de la lista podés filtrar por fuente (de dónde salió la oferta), por ubicación y por puntaje mínimo. Los filtros se aplican sobre todas tus ofertas, no solo sobre las que ves en pantalla.</w:t>
+      </w:r>
+    </w:p>
+    <w:p>
+      <w:pPr>
+        <w:pStyle w:val="ListParagraph"/>
+        <w:numPr>
+          <w:ilvl w:val="0"/>
+          <w:numId w:val="2"/>
+        </w:numPr>
+        <w:spacing w:after="80"/>
+      </w:pPr>
+      <w:r>
+        <w:t xml:space="preserve">Ubicación (ciudad o país): escribí una ciudad o un país. Muchas ofertas remotas figuran solo por país o como "Remoto" o "Worldwide", así que una ciudad puede no devolver nada. Al escribir, el campo te sugiere las ubicaciones que existen en tus ofertas.</w:t>
+      </w:r>
+    </w:p>
+    <w:p>
+      <w:pPr>
+        <w:pStyle w:val="ListParagraph"/>
+        <w:numPr>
+          <w:ilvl w:val="0"/>
+          <w:numId w:val="2"/>
+        </w:numPr>
+        <w:spacing w:after="80"/>
+      </w:pPr>
+      <w:r>
+        <w:t xml:space="preserve">Puntaje mínimo: muestra solo las ofertas con ese puntaje o más. El control llega hasta el máximo posible con tu perfil (la suma de los pesos de tus criterios activos), y debajo se lee, por ejemplo, "Máximo posible con tu perfil: 60 puntos".</w:t>
+      </w:r>
+    </w:p>
+    <w:p>
+      <w:pPr>
+        <w:spacing w:after="160"/>
+      </w:pPr>
+      <w:r>
+        <w:t xml:space="preserve">Si los filtros no devuelven ninguna oferta, el mensaje te sugiere aflojar alguno y el botón "Quitar todos los filtros" los limpia de una vez.</w:t>
       </w:r>
     </w:p>
     <w:p>
@@ -1302,7 +1201,7 @@
           <w:sz w:val="18"/>
           <w:szCs w:val="18"/>
         </w:rPr>
-        <w:t xml:space="preserve">Pantalla de Configuración, con los criterios de afinidad y su peso.</w:t>
+        <w:t xml:space="preserve">Un filtro que no coincide con nada: el mensaje sugiere aflojarlo y hay un botón para quitarlos todos.</w:t>
       </w:r>
     </w:p>
     <w:p>
@@ -1311,124 +1210,15 @@
         <w:spacing w:after="140" w:before="280"/>
       </w:pPr>
       <w:r>
-        <w:t xml:space="preserve">Qué es un criterio</w:t>
-      </w:r>
-    </w:p>
-    <w:p>
-      <w:pPr>
-        <w:spacing w:after="160"/>
-      </w:pPr>
-      <w:r>
-        <w:t xml:space="preserve">Un criterio es una regla simple: "si la oferta menciona tal cosa, sumale tantos puntos". Por ejemplo: "si el stack tecnológico incluye React, sumar 15 puntos", o "si la modalidad es remoto, sumar 10 puntos".</w:t>
-      </w:r>
-    </w:p>
-    <w:p>
-      <w:pPr>
-        <w:pStyle w:val="Heading2"/>
-        <w:spacing w:after="140" w:before="280"/>
-      </w:pPr>
-      <w:r>
-        <w:t xml:space="preserve">Peso</w:t>
-      </w:r>
-    </w:p>
-    <w:p>
-      <w:pPr>
-        <w:spacing w:after="160"/>
-      </w:pPr>
-      <w:r>
-        <w:t xml:space="preserve">El "peso" es la cantidad de puntos que suma ese criterio cuando se cumple. Los criterios con más peso tienen más influencia en el puntaje final: usalo para priorizar lo que más te importa. Por ejemplo, si trabajar en modalidad remoto es innegociable para vos, dale más peso que a una tecnología secundaria.</w:t>
-      </w:r>
-    </w:p>
-    <w:p>
-      <w:pPr>
-        <w:pStyle w:val="Heading2"/>
-        <w:spacing w:after="140" w:before="280"/>
-      </w:pPr>
-      <w:r>
-        <w:t xml:space="preserve">Agregar un nuevo criterio</w:t>
-      </w:r>
-    </w:p>
-    <w:p>
-      <w:pPr>
-        <w:spacing w:after="160"/>
-      </w:pPr>
-      <w:r>
-        <w:t xml:space="preserve">Tocá "Agregar criterio", elegí qué campo de la oferta mirar (tecnologías, modalidad, ubicación, rol, etc.), qué valor buscar, y cuántos puntos sumar si se cumple. También podés desactivar un criterio sin borrarlo, si por ahora no lo querés tener en cuenta.</w:t>
-      </w:r>
-    </w:p>
-    <w:p>
-      <w:pPr>
-        <w:pStyle w:val="Heading2"/>
-        <w:spacing w:after="140" w:before="280"/>
-      </w:pPr>
-      <w:r>
-        <w:t xml:space="preserve">Umbral de inactividad</w:t>
-      </w:r>
-    </w:p>
-    <w:p>
-      <w:pPr>
-        <w:spacing w:after="160"/>
-      </w:pPr>
-      <w:r>
-        <w:t xml:space="preserve">Arriba de los criterios, en la tarjeta "Umbral de Inactividad", elegís después de cuántos días sin novedades querés que Laburin te avise sobre una postulación. Por defecto son 7 días, y podés poner cualquier número entero entre 1 y 90.</w:t>
-      </w:r>
-    </w:p>
-    <w:p>
-      <w:pPr>
-        <w:spacing w:after="160"/>
-      </w:pPr>
-      <w:r>
-        <w:t xml:space="preserve">Escribí el número y salí del campo (o apretá Enter): el valor se guarda solo y se mantiene aunque cierres la sesión. Si ponés un valor que no corresponde, por ejemplo 0 o 100, Laburin te avisa y vuelve al último valor válido.</w:t>
-      </w:r>
-    </w:p>
-    <w:p>
-      <w:pPr>
-        <w:spacing w:after="160"/>
-      </w:pPr>
-      <w:r>
-        <w:t xml:space="preserve">El cambio vale hacia adelante: los avisos que ya tenías no desaparecen ni se recalculan. Si bajás el umbral, las postulaciones que ya llevan más días que el nuevo valor van a mostrar su aviso la próxima vez que abras el Tablero; si lo subís, los avisos que ya estaban siguen hasta que los resuelvas.</w:t>
-      </w:r>
-    </w:p>
-    <w:p>
-      <w:pPr>
-        <w:pStyle w:val="Heading2"/>
-        <w:spacing w:after="140" w:before="280"/>
-      </w:pPr>
-      <w:r>
-        <w:t xml:space="preserve">Qué pasa con las ofertas que ya tenías cargadas</w:t>
-      </w:r>
-    </w:p>
-    <w:p>
-      <w:pPr>
-        <w:spacing w:after="160"/>
-      </w:pPr>
-      <w:r>
-        <w:t xml:space="preserve">Cada vez que agregás, editás, desactivás o borrás un criterio, Laburin recalcula automáticamente el puntaje de todas las ofertas que ya tenías guardadas: no hace falta que hagas nada más. Si entrás a Ofertas después de cambiar un criterio, vas a ver los puntajes actualizados al instante.</w:t>
-      </w:r>
-    </w:p>
-    <w:p>
-      <w:pPr>
-        <w:pStyle w:val="Heading1"/>
-        <w:spacing w:after="200" w:before="400"/>
-      </w:pPr>
-      <w:r>
-        <w:t xml:space="preserve">8. Mi cuenta</w:t>
-      </w:r>
-    </w:p>
-    <w:p>
-      <w:pPr>
-        <w:spacing w:after="160"/>
-      </w:pPr>
-      <w:r>
-        <w:t xml:space="preserve">Además de la configuración del motor de scoring, tenés una sección aparte para los datos de tu propia cuenta: tu nombre, tu contraseña y el tema de la aplicación.</w:t>
-      </w:r>
-    </w:p>
-    <w:p>
-      <w:pPr>
-        <w:spacing w:after="160"/>
-      </w:pPr>
-      <w:r>
-        <w:t xml:space="preserve">Para acceder, tocá "Mi cuenta" en el menú lateral, arriba de "Cerrar Sesión".</w:t>
+        <w:t xml:space="preserve">Moverte entre páginas</w:t>
+      </w:r>
+    </w:p>
+    <w:p>
+      <w:pPr>
+        <w:spacing w:after="160"/>
+      </w:pPr>
+      <w:r>
+        <w:t xml:space="preserve">Las ofertas se muestran de a 30 por página. Al final de la lista vas a ver cuántas ofertas tenés en total (con los filtros que estés usando) y en qué página estás, por ejemplo "37 ofertas · Página 1 de 2", junto con los botones "Anterior" y "Siguiente".</w:t>
       </w:r>
     </w:p>
     <w:p>
@@ -1496,117 +1286,24 @@
           <w:sz w:val="18"/>
           <w:szCs w:val="18"/>
         </w:rPr>
-        <w:t xml:space="preserve">Ventana de "Mi cuenta": nombre, email, cambio de contraseña y tema.</w:t>
-      </w:r>
-    </w:p>
-    <w:p>
-      <w:pPr>
-        <w:spacing w:after="160"/>
-      </w:pPr>
-      <w:r>
-        <w:t xml:space="preserve">Ahí podés:</w:t>
-      </w:r>
-    </w:p>
-    <w:p>
-      <w:pPr>
-        <w:pStyle w:val="ListParagraph"/>
-        <w:numPr>
-          <w:ilvl w:val="0"/>
-          <w:numId w:val="2"/>
-        </w:numPr>
-        <w:spacing w:after="80"/>
-      </w:pPr>
-      <w:r>
-        <w:t xml:space="preserve">Cambiar tu nombre para mostrar (se usa junto con tus iniciales, que aparecen como tu avatar).</w:t>
-      </w:r>
-    </w:p>
-    <w:p>
-      <w:pPr>
-        <w:pStyle w:val="ListParagraph"/>
-        <w:numPr>
-          <w:ilvl w:val="0"/>
-          <w:numId w:val="2"/>
-        </w:numPr>
-        <w:spacing w:after="80"/>
-      </w:pPr>
-      <w:r>
-        <w:t xml:space="preserve">Ver el email con el que te registraste (no se puede editar desde acá).</w:t>
-      </w:r>
-    </w:p>
-    <w:p>
-      <w:pPr>
-        <w:pStyle w:val="ListParagraph"/>
-        <w:numPr>
-          <w:ilvl w:val="0"/>
-          <w:numId w:val="2"/>
-        </w:numPr>
-        <w:spacing w:after="80"/>
-      </w:pPr>
-      <w:r>
-        <w:t xml:space="preserve">Cambiar tu contraseña, con el mismo indicador de fortaleza que viste al registrarte.</w:t>
-      </w:r>
-    </w:p>
-    <w:p>
-      <w:pPr>
-        <w:pStyle w:val="ListParagraph"/>
-        <w:numPr>
-          <w:ilvl w:val="0"/>
-          <w:numId w:val="2"/>
-        </w:numPr>
-        <w:spacing w:after="80"/>
-      </w:pPr>
-      <w:r>
-        <w:t xml:space="preserve">Elegir el tema claro u oscuro de toda la aplicación.</w:t>
-      </w:r>
-    </w:p>
-    <w:p>
-      <w:pPr>
-        <w:pStyle w:val="Heading1"/>
-        <w:spacing w:after="200" w:before="400"/>
-      </w:pPr>
-      <w:r>
-        <w:t xml:space="preserve">9. Recordatorios por inactividad</w:t>
-      </w:r>
-    </w:p>
-    <w:p>
-      <w:pPr>
-        <w:spacing w:after="160"/>
-      </w:pPr>
-      <w:r>
-        <w:t xml:space="preserve">Cuando una postulación lleva varios días sin ninguna novedad, sin que hayas registrado una interacción ni cambiado su estado, Laburin te lo marca con un recordatorio, para que no se te pase hacer un seguimiento.</w:t>
-      </w:r>
-    </w:p>
-    <w:p>
-      <w:pPr>
-        <w:spacing w:after="160"/>
-      </w:pPr>
-      <w:r>
-        <w:t xml:space="preserve">Vos elegís después de cuántos días se avisa: es el "Umbral de Inactividad" que ajustás en Configuración (por defecto, 7 días; ver la sección 7). Si lo cambiás, el nuevo plazo se aplica de ahí en adelante y los avisos que ya tenías no se modifican.</w:t>
-      </w:r>
-    </w:p>
-    <w:p>
-      <w:pPr>
-        <w:spacing w:after="160"/>
-      </w:pPr>
-      <w:r>
-        <w:t xml:space="preserve">Vas a ver este aviso directamente en el Tablero, en la tarjeta de la postulación correspondiente (como se puede ver en la imagen de la sección sobre el Tablero). Alcanza con registrar una interacción nueva o mover la tarjeta de estado para que el recordatorio se resuelva solo.</w:t>
-      </w:r>
-    </w:p>
-    <w:p>
-      <w:pPr>
-        <w:pStyle w:val="Heading1"/>
-        <w:spacing w:after="200" w:before="400"/>
-      </w:pPr>
-      <w:r>
-        <w:t xml:space="preserve">10. Panel de Métricas</w:t>
-      </w:r>
-    </w:p>
-    <w:p>
-      <w:pPr>
-        <w:spacing w:after="160"/>
-      </w:pPr>
-      <w:r>
-        <w:t xml:space="preserve">La sección "Analytics" te muestra un resumen de toda tu búsqueda laboral: cuántas postulaciones tenés activas, cómo se reparten entre las distintas etapas del proceso, cuál es tu puntaje de afinidad promedio, y qué fuentes te están trayendo mejores ofertas.</w:t>
+        <w:t xml:space="preserve">Al final del listado: el total de ofertas, la página actual y los botones para cambiar de página.</w:t>
+      </w:r>
+    </w:p>
+    <w:p>
+      <w:pPr>
+        <w:pStyle w:val="Heading2"/>
+        <w:spacing w:after="140" w:before="280"/>
+      </w:pPr>
+      <w:r>
+        <w:t xml:space="preserve">Importar ofertas automáticamente</w:t>
+      </w:r>
+    </w:p>
+    <w:p>
+      <w:pPr>
+        <w:spacing w:after="160"/>
+      </w:pPr>
+      <w:r>
+        <w:t xml:space="preserve">Tocando "Importar ofertas remotas", Laburin busca ofertas nuevas publicadas en portales de empleo remoto y las agrega a tu lista, calculando el puntaje de cada una según tu perfil. Si una oferta ya la tenías cargada, no se duplica: te avisamos cuántas se importaron y cuántas se omitieron por estar repetidas.</w:t>
       </w:r>
     </w:p>
     <w:p>
@@ -1674,15 +1371,1362 @@
           <w:sz w:val="18"/>
           <w:szCs w:val="18"/>
         </w:rPr>
-        <w:t xml:space="preserve">Panel de Métricas, con el resumen general de la búsqueda.</w:t>
-      </w:r>
-    </w:p>
-    <w:p>
-      <w:pPr>
-        <w:spacing w:after="160"/>
-      </w:pPr>
-      <w:r>
-        <w:t xml:space="preserve">Te sirve para tomar una foto rápida de cómo viene tu búsqueda en general, sin tener que repasar oferta por oferta.</w:t>
+        <w:t xml:space="preserve">Resultado de una importación: cuántas ofertas nuevas entraron.</w:t>
+      </w:r>
+    </w:p>
+    <w:p>
+      <w:pPr>
+        <w:pStyle w:val="Heading2"/>
+        <w:spacing w:after="140" w:before="280"/>
+      </w:pPr>
+      <w:r>
+        <w:t xml:space="preserve">Cargar una oferta manualmente</w:t>
+      </w:r>
+    </w:p>
+    <w:p>
+      <w:pPr>
+        <w:spacing w:after="160"/>
+      </w:pPr>
+      <w:r>
+        <w:t xml:space="preserve">Si encontraste una oferta por tu cuenta (en LinkedIn, en la web de una empresa, por referencia de alguien), podés cargarla vos mismo con "Nueva oferta", completando empresa, puesto, modalidad, ubicación y tecnologías.</w:t>
+      </w:r>
+    </w:p>
+    <w:p>
+      <w:pPr>
+        <w:pStyle w:val="Heading2"/>
+        <w:spacing w:after="140" w:before="280"/>
+      </w:pPr>
+      <w:r>
+        <w:t xml:space="preserve">Editar o borrar una oferta</w:t>
+      </w:r>
+    </w:p>
+    <w:p>
+      <w:pPr>
+        <w:spacing w:after="160"/>
+      </w:pPr>
+      <w:r>
+        <w:t xml:space="preserve">Desde la tarjeta de cada oferta podés editarla (ícono de lápiz) o borrarla (ícono de tacho) individualmente.</w:t>
+      </w:r>
+    </w:p>
+    <w:p>
+      <w:pPr>
+        <w:spacing w:after="160"/>
+      </w:pPr>
+      <w:r>
+        <w:t xml:space="preserve">Si querés borrar varias a la vez, marcá las casillas de las ofertas que querés eliminar y usá "Eliminar seleccionadas" en la barra que aparece arriba de la lista. La casilla "Seleccionar esta página" marca las ofertas que estás viendo; si tenés más de una página, aparece además el enlace "Seleccionar las N ofertas que coinciden", que marca todas las que cumplen los filtros, estén en la página que estén. El botón "Eliminar seleccionadas" siempre te dice cuántas vas a borrar, y antes de hacerlo Laburin te pide confirmación.</w:t>
+      </w:r>
+    </w:p>
+    <w:p>
+      <w:pPr>
+        <w:pStyle w:val="Heading2"/>
+        <w:spacing w:after="140" w:before="280"/>
+      </w:pPr>
+      <w:r>
+        <w:t xml:space="preserve">Postularte</w:t>
+      </w:r>
+    </w:p>
+    <w:p>
+      <w:pPr>
+        <w:spacing w:after="160"/>
+      </w:pPr>
+      <w:r>
+        <w:t xml:space="preserve">Cuando encontrás una oferta a la que querés postularte, tocá "Postularme". Esto la mueve a Mis postulaciones, en la columna "Por aplicar", para que empieces a hacerle seguimiento.</w:t>
+      </w:r>
+    </w:p>
+    <w:p>
+      <w:pPr>
+        <w:pStyle w:val="Heading1"/>
+        <w:spacing w:after="200" w:before="400"/>
+      </w:pPr>
+      <w:r>
+        <w:t xml:space="preserve">5. Mis postulaciones</w:t>
+      </w:r>
+    </w:p>
+    <w:p>
+      <w:pPr>
+        <w:spacing w:after="160"/>
+      </w:pPr>
+      <w:r>
+        <w:t xml:space="preserve">"Mis postulaciones" es el tablero donde seguís el estado de cada postulación, desde que decidís postularte hasta que termina el proceso.</w:t>
+      </w:r>
+    </w:p>
+    <w:p>
+      <w:pPr>
+        <w:pBdr>
+          <w:top w:val="single" w:color="CCCCCC" w:sz="4"/>
+          <w:left w:val="single" w:color="CCCCCC" w:sz="4"/>
+          <w:bottom w:val="single" w:color="CCCCCC" w:sz="4"/>
+          <w:right w:val="single" w:color="CCCCCC" w:sz="4"/>
+        </w:pBdr>
+        <w:spacing w:after="80" w:before="120"/>
+        <w:jc w:val="center"/>
+      </w:pPr>
+      <w:r>
+        <w:drawing>
+          <wp:inline distT="0" distB="0" distL="0" distR="0">
+            <wp:extent cx="5715000" cy="3209925"/>
+            <wp:effectExtent t="0" r="0" b="0" l="0"/>
+            <wp:docPr id="13" name="" descr="" title=""/>
+            <wp:cNvGraphicFramePr>
+              <a:graphicFrameLocks xmlns:a="http://schemas.openxmlformats.org/drawingml/2006/main" noChangeAspect="1"/>
+            </wp:cNvGraphicFramePr>
+            <a:graphic xmlns:a="http://schemas.openxmlformats.org/drawingml/2006/main">
+              <a:graphicData uri="http://schemas.openxmlformats.org/drawingml/2006/picture">
+                <pic:pic xmlns:pic="http://schemas.openxmlformats.org/drawingml/2006/picture">
+                  <pic:nvPicPr>
+                    <pic:cNvPr id="0" name="" descr=""/>
+                    <pic:cNvPicPr>
+                      <a:picLocks noChangeAspect="1" noChangeArrowheads="1"/>
+                    </pic:cNvPicPr>
+                  </pic:nvPicPr>
+                  <pic:blipFill>
+                    <a:blip r:embed="rId19" cstate="none"/>
+                    <a:srcRect/>
+                    <a:stretch>
+                      <a:fillRect/>
+                    </a:stretch>
+                  </pic:blipFill>
+                  <pic:spPr bwMode="auto">
+                    <a:xfrm>
+                      <a:off x="0" y="0"/>
+                      <a:ext cx="5715000" cy="3209925"/>
+                    </a:xfrm>
+                    <a:prstGeom prst="rect">
+                      <a:avLst/>
+                    </a:prstGeom>
+                  </pic:spPr>
+                </pic:pic>
+              </a:graphicData>
+            </a:graphic>
+          </wp:inline>
+        </w:drawing>
+      </w:r>
+    </w:p>
+    <w:p>
+      <w:pPr>
+        <w:spacing w:after="220"/>
+        <w:jc w:val="center"/>
+      </w:pPr>
+      <w:r>
+        <w:rPr>
+          <w:i/>
+          <w:iCs/>
+          <w:color w:val="555555"/>
+          <w:sz w:val="18"/>
+          <w:szCs w:val="18"/>
+        </w:rPr>
+        <w:t xml:space="preserve">Mis postulaciones en computadora, con las seis columnas del proceso y un recordatorio en una tarjeta.</w:t>
+      </w:r>
+    </w:p>
+    <w:p>
+      <w:pPr>
+        <w:spacing w:after="160"/>
+      </w:pPr>
+      <w:r>
+        <w:t xml:space="preserve">Tiene seis columnas: Por aplicar, Aplicado, En proceso, Entrevista, Oferta y Rechazado. Cada postulación es una tarjeta que vas moviendo de columna a medida que avanza el proceso. Si todavía no tenés ninguna, la pantalla te lo dice y un botón te lleva a Ofertas.</w:t>
+      </w:r>
+    </w:p>
+    <w:p>
+      <w:pPr>
+        <w:pStyle w:val="Heading2"/>
+        <w:spacing w:after="140" w:before="280"/>
+      </w:pPr>
+      <w:r>
+        <w:t xml:space="preserve">En computadora</w:t>
+      </w:r>
+    </w:p>
+    <w:p>
+      <w:pPr>
+        <w:spacing w:after="160"/>
+      </w:pPr>
+      <w:r>
+        <w:t xml:space="preserve">Podés arrastrar la tarjeta de una columna a otra con el mouse: hacé clic, mantené presionado y soltá en la columna que corresponda.</w:t>
+      </w:r>
+    </w:p>
+    <w:p>
+      <w:pPr>
+        <w:pStyle w:val="Heading2"/>
+        <w:spacing w:after="140" w:before="280"/>
+      </w:pPr>
+      <w:r>
+        <w:t xml:space="preserve">En el celular</w:t>
+      </w:r>
+    </w:p>
+    <w:p>
+      <w:pPr>
+        <w:spacing w:after="160"/>
+      </w:pPr>
+      <w:r>
+        <w:t xml:space="preserve">Como arrastrar con el dedo en una pantalla chica puede ser poco preciso, en el celular cada tarjeta tiene un selector "Mover a...": elegís la columna de destino en la lista, y listo.</w:t>
+      </w:r>
+    </w:p>
+    <w:p>
+      <w:pPr>
+        <w:pBdr>
+          <w:top w:val="single" w:color="CCCCCC" w:sz="4"/>
+          <w:left w:val="single" w:color="CCCCCC" w:sz="4"/>
+          <w:bottom w:val="single" w:color="CCCCCC" w:sz="4"/>
+          <w:right w:val="single" w:color="CCCCCC" w:sz="4"/>
+        </w:pBdr>
+        <w:spacing w:after="80" w:before="120"/>
+        <w:jc w:val="center"/>
+      </w:pPr>
+      <w:r>
+        <w:drawing>
+          <wp:inline distT="0" distB="0" distL="0" distR="0">
+            <wp:extent cx="2190750" cy="4743450"/>
+            <wp:effectExtent t="0" r="0" b="0" l="0"/>
+            <wp:docPr id="14" name="" descr="" title=""/>
+            <wp:cNvGraphicFramePr>
+              <a:graphicFrameLocks xmlns:a="http://schemas.openxmlformats.org/drawingml/2006/main" noChangeAspect="1"/>
+            </wp:cNvGraphicFramePr>
+            <a:graphic xmlns:a="http://schemas.openxmlformats.org/drawingml/2006/main">
+              <a:graphicData uri="http://schemas.openxmlformats.org/drawingml/2006/picture">
+                <pic:pic xmlns:pic="http://schemas.openxmlformats.org/drawingml/2006/picture">
+                  <pic:nvPicPr>
+                    <pic:cNvPr id="0" name="" descr=""/>
+                    <pic:cNvPicPr>
+                      <a:picLocks noChangeAspect="1" noChangeArrowheads="1"/>
+                    </pic:cNvPicPr>
+                  </pic:nvPicPr>
+                  <pic:blipFill>
+                    <a:blip r:embed="rId20" cstate="none"/>
+                    <a:srcRect/>
+                    <a:stretch>
+                      <a:fillRect/>
+                    </a:stretch>
+                  </pic:blipFill>
+                  <pic:spPr bwMode="auto">
+                    <a:xfrm>
+                      <a:off x="0" y="0"/>
+                      <a:ext cx="2190750" cy="4743450"/>
+                    </a:xfrm>
+                    <a:prstGeom prst="rect">
+                      <a:avLst/>
+                    </a:prstGeom>
+                  </pic:spPr>
+                </pic:pic>
+              </a:graphicData>
+            </a:graphic>
+          </wp:inline>
+        </w:drawing>
+      </w:r>
+    </w:p>
+    <w:p>
+      <w:pPr>
+        <w:spacing w:after="220"/>
+        <w:jc w:val="center"/>
+      </w:pPr>
+      <w:r>
+        <w:rPr>
+          <w:i/>
+          <w:iCs/>
+          <w:color w:val="555555"/>
+          <w:sz w:val="18"/>
+          <w:szCs w:val="18"/>
+        </w:rPr>
+        <w:t xml:space="preserve">En el celular, un selector reemplaza al arrastre para cambiar de columna.</w:t>
+      </w:r>
+    </w:p>
+    <w:p>
+      <w:pPr>
+        <w:spacing w:after="160"/>
+      </w:pPr>
+      <w:r>
+        <w:t xml:space="preserve">Laburin guarda el historial de cada cambio de estado, así que siempre queda registro de cuándo pasó cada postulación de una etapa a otra.</w:t>
+      </w:r>
+    </w:p>
+    <w:p>
+      <w:pPr>
+        <w:pStyle w:val="Heading1"/>
+        <w:spacing w:after="200" w:before="400"/>
+      </w:pPr>
+      <w:r>
+        <w:t xml:space="preserve">6. Ficha de postulación</w:t>
+      </w:r>
+    </w:p>
+    <w:p>
+      <w:pPr>
+        <w:spacing w:after="160"/>
+      </w:pPr>
+      <w:r>
+        <w:t xml:space="preserve">Si tocás una tarjeta de Mis postulaciones, se abre la ficha de esa postulación, con todos los detalles de la oferta y una línea de tiempo con cada contacto que tuviste con la empresa.</w:t>
+      </w:r>
+    </w:p>
+    <w:p>
+      <w:pPr>
+        <w:pBdr>
+          <w:top w:val="single" w:color="CCCCCC" w:sz="4"/>
+          <w:left w:val="single" w:color="CCCCCC" w:sz="4"/>
+          <w:bottom w:val="single" w:color="CCCCCC" w:sz="4"/>
+          <w:right w:val="single" w:color="CCCCCC" w:sz="4"/>
+        </w:pBdr>
+        <w:spacing w:after="80" w:before="120"/>
+        <w:jc w:val="center"/>
+      </w:pPr>
+      <w:r>
+        <w:drawing>
+          <wp:inline distT="0" distB="0" distL="0" distR="0">
+            <wp:extent cx="5715000" cy="3209925"/>
+            <wp:effectExtent t="0" r="0" b="0" l="0"/>
+            <wp:docPr id="15" name="" descr="" title=""/>
+            <wp:cNvGraphicFramePr>
+              <a:graphicFrameLocks xmlns:a="http://schemas.openxmlformats.org/drawingml/2006/main" noChangeAspect="1"/>
+            </wp:cNvGraphicFramePr>
+            <a:graphic xmlns:a="http://schemas.openxmlformats.org/drawingml/2006/main">
+              <a:graphicData uri="http://schemas.openxmlformats.org/drawingml/2006/picture">
+                <pic:pic xmlns:pic="http://schemas.openxmlformats.org/drawingml/2006/picture">
+                  <pic:nvPicPr>
+                    <pic:cNvPr id="0" name="" descr=""/>
+                    <pic:cNvPicPr>
+                      <a:picLocks noChangeAspect="1" noChangeArrowheads="1"/>
+                    </pic:cNvPicPr>
+                  </pic:nvPicPr>
+                  <pic:blipFill>
+                    <a:blip r:embed="rId21" cstate="none"/>
+                    <a:srcRect/>
+                    <a:stretch>
+                      <a:fillRect/>
+                    </a:stretch>
+                  </pic:blipFill>
+                  <pic:spPr bwMode="auto">
+                    <a:xfrm>
+                      <a:off x="0" y="0"/>
+                      <a:ext cx="5715000" cy="3209925"/>
+                    </a:xfrm>
+                    <a:prstGeom prst="rect">
+                      <a:avLst/>
+                    </a:prstGeom>
+                  </pic:spPr>
+                </pic:pic>
+              </a:graphicData>
+            </a:graphic>
+          </wp:inline>
+        </w:drawing>
+      </w:r>
+    </w:p>
+    <w:p>
+      <w:pPr>
+        <w:spacing w:after="220"/>
+        <w:jc w:val="center"/>
+      </w:pPr>
+      <w:r>
+        <w:rPr>
+          <w:i/>
+          <w:iCs/>
+          <w:color w:val="555555"/>
+          <w:sz w:val="18"/>
+          <w:szCs w:val="18"/>
+        </w:rPr>
+        <w:t xml:space="preserve">Ficha de una postulación, con la línea de tiempo de interacciones registradas.</w:t>
+      </w:r>
+    </w:p>
+    <w:p>
+      <w:pPr>
+        <w:pStyle w:val="Heading2"/>
+        <w:spacing w:after="140" w:before="280"/>
+      </w:pPr>
+      <w:r>
+        <w:t xml:space="preserve">Agregar una interacción</w:t>
+      </w:r>
+    </w:p>
+    <w:p>
+      <w:pPr>
+        <w:spacing w:after="160"/>
+      </w:pPr>
+      <w:r>
+        <w:t xml:space="preserve">Cada vez que tengas novedades (te mandaron un mail, te llamaron, tuviste una entrevista), podés registrarlo como una interacción: elegís el tipo, la fecha, y podés agregar una nota con el detalle. Esto te sirve para no perder el hilo de en qué quedó cada proceso, sobre todo cuando tenés varias postulaciones activas al mismo tiempo.</w:t>
+      </w:r>
+    </w:p>
+    <w:p>
+      <w:pPr>
+        <w:pStyle w:val="Heading2"/>
+        <w:spacing w:after="140" w:before="280"/>
+      </w:pPr>
+      <w:r>
+        <w:t xml:space="preserve">Borrar una interacción</w:t>
+      </w:r>
+    </w:p>
+    <w:p>
+      <w:pPr>
+        <w:spacing w:after="160"/>
+      </w:pPr>
+      <w:r>
+        <w:t xml:space="preserve">Si cargaste una interacción por error, podés borrarla desde la misma línea de tiempo.</w:t>
+      </w:r>
+    </w:p>
+    <w:p>
+      <w:pPr>
+        <w:pStyle w:val="Heading1"/>
+        <w:spacing w:after="200" w:before="400"/>
+      </w:pPr>
+      <w:r>
+        <w:t xml:space="preserve">7. Mi perfil de búsqueda</w:t>
+      </w:r>
+    </w:p>
+    <w:p>
+      <w:pPr>
+        <w:spacing w:after="160"/>
+      </w:pPr>
+      <w:r>
+        <w:t xml:space="preserve">En "Mi perfil de búsqueda" está todo lo que le dice a Laburin qué buscás. Con estos datos calculamos el puntaje de cada oferta, y los cambios se guardan solos. La pantalla tiene tres bloques, en el orden en que se usan.</w:t>
+      </w:r>
+    </w:p>
+    <w:p>
+      <w:pPr>
+        <w:pBdr>
+          <w:top w:val="single" w:color="CCCCCC" w:sz="4"/>
+          <w:left w:val="single" w:color="CCCCCC" w:sz="4"/>
+          <w:bottom w:val="single" w:color="CCCCCC" w:sz="4"/>
+          <w:right w:val="single" w:color="CCCCCC" w:sz="4"/>
+        </w:pBdr>
+        <w:spacing w:after="80" w:before="120"/>
+        <w:jc w:val="center"/>
+      </w:pPr>
+      <w:r>
+        <w:drawing>
+          <wp:inline distT="0" distB="0" distL="0" distR="0">
+            <wp:extent cx="5715000" cy="3209925"/>
+            <wp:effectExtent t="0" r="0" b="0" l="0"/>
+            <wp:docPr id="16" name="" descr="" title=""/>
+            <wp:cNvGraphicFramePr>
+              <a:graphicFrameLocks xmlns:a="http://schemas.openxmlformats.org/drawingml/2006/main" noChangeAspect="1"/>
+            </wp:cNvGraphicFramePr>
+            <a:graphic xmlns:a="http://schemas.openxmlformats.org/drawingml/2006/main">
+              <a:graphicData uri="http://schemas.openxmlformats.org/drawingml/2006/picture">
+                <pic:pic xmlns:pic="http://schemas.openxmlformats.org/drawingml/2006/picture">
+                  <pic:nvPicPr>
+                    <pic:cNvPr id="0" name="" descr=""/>
+                    <pic:cNvPicPr>
+                      <a:picLocks noChangeAspect="1" noChangeArrowheads="1"/>
+                    </pic:cNvPicPr>
+                  </pic:nvPicPr>
+                  <pic:blipFill>
+                    <a:blip r:embed="rId22" cstate="none"/>
+                    <a:srcRect/>
+                    <a:stretch>
+                      <a:fillRect/>
+                    </a:stretch>
+                  </pic:blipFill>
+                  <pic:spPr bwMode="auto">
+                    <a:xfrm>
+                      <a:off x="0" y="0"/>
+                      <a:ext cx="5715000" cy="3209925"/>
+                    </a:xfrm>
+                    <a:prstGeom prst="rect">
+                      <a:avLst/>
+                    </a:prstGeom>
+                  </pic:spPr>
+                </pic:pic>
+              </a:graphicData>
+            </a:graphic>
+          </wp:inline>
+        </w:drawing>
+      </w:r>
+    </w:p>
+    <w:p>
+      <w:pPr>
+        <w:spacing w:after="220"/>
+        <w:jc w:val="center"/>
+      </w:pPr>
+      <w:r>
+        <w:rPr>
+          <w:i/>
+          <w:iCs/>
+          <w:color w:val="555555"/>
+          <w:sz w:val="18"/>
+          <w:szCs w:val="18"/>
+        </w:rPr>
+        <w:t xml:space="preserve">Mi perfil de búsqueda: "¿Qué estoy buscando?" y "Mis tecnologías y cuánto pesan".</w:t>
+      </w:r>
+    </w:p>
+    <w:p>
+      <w:pPr>
+        <w:pStyle w:val="Heading2"/>
+        <w:spacing w:after="140" w:before="280"/>
+      </w:pPr>
+      <w:r>
+        <w:t xml:space="preserve">¿Qué estoy buscando?</w:t>
+      </w:r>
+    </w:p>
+    <w:p>
+      <w:pPr>
+        <w:spacing w:after="160"/>
+      </w:pPr>
+      <w:r>
+        <w:t xml:space="preserve">Acá elegís cómo y dónde querés trabajar: la modalidad (remoto, híbrido o presencial) y la ubicación. Las ofertas que coinciden suman puntos. Una aclaración: con ofertas remotas, la ubicación casi nunca suma puntos, porque muchas dicen "Worldwide" o solo un país.</w:t>
+      </w:r>
+    </w:p>
+    <w:p>
+      <w:pPr>
+        <w:pStyle w:val="Heading2"/>
+        <w:spacing w:after="140" w:before="280"/>
+      </w:pPr>
+      <w:r>
+        <w:t xml:space="preserve">Mis tecnologías y cuánto pesan</w:t>
+      </w:r>
+    </w:p>
+    <w:p>
+      <w:pPr>
+        <w:spacing w:after="160"/>
+      </w:pPr>
+      <w:r>
+        <w:t xml:space="preserve">Las tecnologías que te interesan. Cada una tiene un peso, que es la cantidad de puntos que suma cuando una oferta la menciona: cuanto más peso, más arriba aparecen las ofertas con esa tecnología. Si el trabajo remoto es innegociable para vos, dale más peso a la modalidad que a una tecnología secundaria. Podés agregar tecnologías nuevas, cambiarles el peso, desactivarlas sin borrarlas o eliminarlas.</w:t>
+      </w:r>
+    </w:p>
+    <w:p>
+      <w:pPr>
+        <w:spacing w:after="160"/>
+      </w:pPr>
+      <w:r>
+        <w:t xml:space="preserve">El peso inicial es 15 puntos por tecnología, 10 por modalidad y 5 por ubicación, y es el mismo si cargaste el dato en la configuración inicial o lo agregás después acá.</w:t>
+      </w:r>
+    </w:p>
+    <w:p>
+      <w:pPr>
+        <w:pStyle w:val="Heading2"/>
+        <w:spacing w:after="140" w:before="280"/>
+      </w:pPr>
+      <w:r>
+        <w:t xml:space="preserve">Avisos de seguimiento</w:t>
+      </w:r>
+    </w:p>
+    <w:p>
+      <w:pPr>
+        <w:spacing w:after="160"/>
+      </w:pPr>
+      <w:r>
+        <w:t xml:space="preserve">En la tarjeta "Recordatorio por falta de novedades" elegís después de cuántos días sin novedades querés que Laburin te avise sobre una postulación. Por defecto son 7 días, y podés poner cualquier número entero entre 1 y 90. El texto lo aclara: solo te mostramos un recordatorio en Mis postulaciones; no se borra nada.</w:t>
+      </w:r>
+    </w:p>
+    <w:p>
+      <w:pPr>
+        <w:pBdr>
+          <w:top w:val="single" w:color="CCCCCC" w:sz="4"/>
+          <w:left w:val="single" w:color="CCCCCC" w:sz="4"/>
+          <w:bottom w:val="single" w:color="CCCCCC" w:sz="4"/>
+          <w:right w:val="single" w:color="CCCCCC" w:sz="4"/>
+        </w:pBdr>
+        <w:spacing w:after="80" w:before="120"/>
+        <w:jc w:val="center"/>
+      </w:pPr>
+      <w:r>
+        <w:drawing>
+          <wp:inline distT="0" distB="0" distL="0" distR="0">
+            <wp:extent cx="5715000" cy="3209925"/>
+            <wp:effectExtent t="0" r="0" b="0" l="0"/>
+            <wp:docPr id="17" name="" descr="" title=""/>
+            <wp:cNvGraphicFramePr>
+              <a:graphicFrameLocks xmlns:a="http://schemas.openxmlformats.org/drawingml/2006/main" noChangeAspect="1"/>
+            </wp:cNvGraphicFramePr>
+            <a:graphic xmlns:a="http://schemas.openxmlformats.org/drawingml/2006/main">
+              <a:graphicData uri="http://schemas.openxmlformats.org/drawingml/2006/picture">
+                <pic:pic xmlns:pic="http://schemas.openxmlformats.org/drawingml/2006/picture">
+                  <pic:nvPicPr>
+                    <pic:cNvPr id="0" name="" descr=""/>
+                    <pic:cNvPicPr>
+                      <a:picLocks noChangeAspect="1" noChangeArrowheads="1"/>
+                    </pic:cNvPicPr>
+                  </pic:nvPicPr>
+                  <pic:blipFill>
+                    <a:blip r:embed="rId23" cstate="none"/>
+                    <a:srcRect/>
+                    <a:stretch>
+                      <a:fillRect/>
+                    </a:stretch>
+                  </pic:blipFill>
+                  <pic:spPr bwMode="auto">
+                    <a:xfrm>
+                      <a:off x="0" y="0"/>
+                      <a:ext cx="5715000" cy="3209925"/>
+                    </a:xfrm>
+                    <a:prstGeom prst="rect">
+                      <a:avLst/>
+                    </a:prstGeom>
+                  </pic:spPr>
+                </pic:pic>
+              </a:graphicData>
+            </a:graphic>
+          </wp:inline>
+        </w:drawing>
+      </w:r>
+    </w:p>
+    <w:p>
+      <w:pPr>
+        <w:spacing w:after="220"/>
+        <w:jc w:val="center"/>
+      </w:pPr>
+      <w:r>
+        <w:rPr>
+          <w:i/>
+          <w:iCs/>
+          <w:color w:val="555555"/>
+          <w:sz w:val="18"/>
+          <w:szCs w:val="18"/>
+        </w:rPr>
+        <w:t xml:space="preserve">Avisos de seguimiento: el umbral de días y la aclaración de que solo es un recordatorio.</w:t>
+      </w:r>
+    </w:p>
+    <w:p>
+      <w:pPr>
+        <w:spacing w:after="160"/>
+      </w:pPr>
+      <w:r>
+        <w:t xml:space="preserve">Escribí el número y salí del campo (o apretá Enter): el valor se guarda solo y se mantiene aunque cierres la sesión. Si ponés un valor que no corresponde, por ejemplo 0 o 100, Laburin te avisa y vuelve al último valor válido.</w:t>
+      </w:r>
+    </w:p>
+    <w:p>
+      <w:pPr>
+        <w:spacing w:after="160"/>
+      </w:pPr>
+      <w:r>
+        <w:t xml:space="preserve">El cambio vale hacia adelante: los avisos que ya tenías no desaparecen ni se recalculan. Si bajás el umbral, las postulaciones que ya llevan más días que el nuevo valor van a mostrar su aviso la próxima vez que abras Mis postulaciones; si lo subís, los avisos que ya estaban siguen hasta que los resuelvas.</w:t>
+      </w:r>
+    </w:p>
+    <w:p>
+      <w:pPr>
+        <w:pStyle w:val="Heading2"/>
+        <w:spacing w:after="140" w:before="280"/>
+      </w:pPr>
+      <w:r>
+        <w:t xml:space="preserve">Qué pasa con las ofertas que ya tenías cargadas</w:t>
+      </w:r>
+    </w:p>
+    <w:p>
+      <w:pPr>
+        <w:spacing w:after="160"/>
+      </w:pPr>
+      <w:r>
+        <w:t xml:space="preserve">Cada vez que agregás, editás, desactivás o borrás un criterio, Laburin recalcula automáticamente el puntaje de todas las ofertas que ya tenías guardadas: no hace falta que hagas nada más. Si entrás a Ofertas después de cambiar un criterio, vas a ver los puntajes actualizados.</w:t>
+      </w:r>
+    </w:p>
+    <w:p>
+      <w:pPr>
+        <w:pStyle w:val="Heading1"/>
+        <w:spacing w:after="200" w:before="400"/>
+      </w:pPr>
+      <w:r>
+        <w:t xml:space="preserve">8. Mi cuenta</w:t>
+      </w:r>
+    </w:p>
+    <w:p>
+      <w:pPr>
+        <w:spacing w:after="160"/>
+      </w:pPr>
+      <w:r>
+        <w:t xml:space="preserve">Además del perfil de búsqueda, tenés una sección aparte para los datos de tu propia cuenta: tu nombre, tu contraseña y el tema de la aplicación. Para acceder, tocá "Mi cuenta" en el menú lateral, arriba de "Cerrar Sesión".</w:t>
+      </w:r>
+    </w:p>
+    <w:p>
+      <w:pPr>
+        <w:pBdr>
+          <w:top w:val="single" w:color="CCCCCC" w:sz="4"/>
+          <w:left w:val="single" w:color="CCCCCC" w:sz="4"/>
+          <w:bottom w:val="single" w:color="CCCCCC" w:sz="4"/>
+          <w:right w:val="single" w:color="CCCCCC" w:sz="4"/>
+        </w:pBdr>
+        <w:spacing w:after="80" w:before="120"/>
+        <w:jc w:val="center"/>
+      </w:pPr>
+      <w:r>
+        <w:drawing>
+          <wp:inline distT="0" distB="0" distL="0" distR="0">
+            <wp:extent cx="5715000" cy="3209925"/>
+            <wp:effectExtent t="0" r="0" b="0" l="0"/>
+            <wp:docPr id="18" name="" descr="" title=""/>
+            <wp:cNvGraphicFramePr>
+              <a:graphicFrameLocks xmlns:a="http://schemas.openxmlformats.org/drawingml/2006/main" noChangeAspect="1"/>
+            </wp:cNvGraphicFramePr>
+            <a:graphic xmlns:a="http://schemas.openxmlformats.org/drawingml/2006/main">
+              <a:graphicData uri="http://schemas.openxmlformats.org/drawingml/2006/picture">
+                <pic:pic xmlns:pic="http://schemas.openxmlformats.org/drawingml/2006/picture">
+                  <pic:nvPicPr>
+                    <pic:cNvPr id="0" name="" descr=""/>
+                    <pic:cNvPicPr>
+                      <a:picLocks noChangeAspect="1" noChangeArrowheads="1"/>
+                    </pic:cNvPicPr>
+                  </pic:nvPicPr>
+                  <pic:blipFill>
+                    <a:blip r:embed="rId24" cstate="none"/>
+                    <a:srcRect/>
+                    <a:stretch>
+                      <a:fillRect/>
+                    </a:stretch>
+                  </pic:blipFill>
+                  <pic:spPr bwMode="auto">
+                    <a:xfrm>
+                      <a:off x="0" y="0"/>
+                      <a:ext cx="5715000" cy="3209925"/>
+                    </a:xfrm>
+                    <a:prstGeom prst="rect">
+                      <a:avLst/>
+                    </a:prstGeom>
+                  </pic:spPr>
+                </pic:pic>
+              </a:graphicData>
+            </a:graphic>
+          </wp:inline>
+        </w:drawing>
+      </w:r>
+    </w:p>
+    <w:p>
+      <w:pPr>
+        <w:spacing w:after="220"/>
+        <w:jc w:val="center"/>
+      </w:pPr>
+      <w:r>
+        <w:rPr>
+          <w:i/>
+          <w:iCs/>
+          <w:color w:val="555555"/>
+          <w:sz w:val="18"/>
+          <w:szCs w:val="18"/>
+        </w:rPr>
+        <w:t xml:space="preserve">Ventana de "Mi cuenta": nombre, email, aviso de privacidad, cambio de contraseña y tema.</w:t>
+      </w:r>
+    </w:p>
+    <w:p>
+      <w:pPr>
+        <w:spacing w:after="160"/>
+      </w:pPr>
+      <w:r>
+        <w:t xml:space="preserve">Ahí podés:</w:t>
+      </w:r>
+    </w:p>
+    <w:p>
+      <w:pPr>
+        <w:pStyle w:val="ListParagraph"/>
+        <w:numPr>
+          <w:ilvl w:val="0"/>
+          <w:numId w:val="2"/>
+        </w:numPr>
+        <w:spacing w:after="80"/>
+      </w:pPr>
+      <w:r>
+        <w:t xml:space="preserve">Cambiar tu nombre para mostrar (se usa junto con tus iniciales, que aparecen como tu avatar). El equipo de Laburin lo ve junto a tu perfil de búsqueda.</w:t>
+      </w:r>
+    </w:p>
+    <w:p>
+      <w:pPr>
+        <w:pStyle w:val="ListParagraph"/>
+        <w:numPr>
+          <w:ilvl w:val="0"/>
+          <w:numId w:val="2"/>
+        </w:numPr>
+        <w:spacing w:after="80"/>
+      </w:pPr>
+      <w:r>
+        <w:t xml:space="preserve">Ver el email con el que te registraste (no se puede editar desde acá).</w:t>
+      </w:r>
+    </w:p>
+    <w:p>
+      <w:pPr>
+        <w:pStyle w:val="ListParagraph"/>
+        <w:numPr>
+          <w:ilvl w:val="0"/>
+          <w:numId w:val="2"/>
+        </w:numPr>
+        <w:spacing w:after="80"/>
+      </w:pPr>
+      <w:r>
+        <w:t xml:space="preserve">Cambiar tu contraseña (al menos 8 caracteres), con el mismo indicador de fortaleza que viste al registrarte.</w:t>
+      </w:r>
+    </w:p>
+    <w:p>
+      <w:pPr>
+        <w:pStyle w:val="ListParagraph"/>
+        <w:numPr>
+          <w:ilvl w:val="0"/>
+          <w:numId w:val="2"/>
+        </w:numPr>
+        <w:spacing w:after="80"/>
+      </w:pPr>
+      <w:r>
+        <w:t xml:space="preserve">Elegir el tema claro u oscuro de toda la aplicación.</w:t>
+      </w:r>
+    </w:p>
+    <w:p>
+      <w:pPr>
+        <w:pStyle w:val="Heading1"/>
+        <w:spacing w:after="200" w:before="400"/>
+      </w:pPr>
+      <w:r>
+        <w:t xml:space="preserve">9. Mensajes</w:t>
+      </w:r>
+    </w:p>
+    <w:p>
+      <w:pPr>
+        <w:spacing w:after="160"/>
+      </w:pPr>
+      <w:r>
+        <w:t xml:space="preserve">En "Mensajes" aparecen los avisos del equipo de Laburin sobre tu perfil. El primero es el de bienvenida, que recibís al terminar la configuración inicial: "Tu perfil quedó registrado y vamos a tener en cuenta tu solicitud." Más adelante el equipo puede escribirte, por ejemplo, para pedirte un dato que falta.</w:t>
+      </w:r>
+    </w:p>
+    <w:p>
+      <w:pPr>
+        <w:pBdr>
+          <w:top w:val="single" w:color="CCCCCC" w:sz="4"/>
+          <w:left w:val="single" w:color="CCCCCC" w:sz="4"/>
+          <w:bottom w:val="single" w:color="CCCCCC" w:sz="4"/>
+          <w:right w:val="single" w:color="CCCCCC" w:sz="4"/>
+        </w:pBdr>
+        <w:spacing w:after="80" w:before="120"/>
+        <w:jc w:val="center"/>
+      </w:pPr>
+      <w:r>
+        <w:drawing>
+          <wp:inline distT="0" distB="0" distL="0" distR="0">
+            <wp:extent cx="5715000" cy="3209925"/>
+            <wp:effectExtent t="0" r="0" b="0" l="0"/>
+            <wp:docPr id="19" name="" descr="" title=""/>
+            <wp:cNvGraphicFramePr>
+              <a:graphicFrameLocks xmlns:a="http://schemas.openxmlformats.org/drawingml/2006/main" noChangeAspect="1"/>
+            </wp:cNvGraphicFramePr>
+            <a:graphic xmlns:a="http://schemas.openxmlformats.org/drawingml/2006/main">
+              <a:graphicData uri="http://schemas.openxmlformats.org/drawingml/2006/picture">
+                <pic:pic xmlns:pic="http://schemas.openxmlformats.org/drawingml/2006/picture">
+                  <pic:nvPicPr>
+                    <pic:cNvPr id="0" name="" descr=""/>
+                    <pic:cNvPicPr>
+                      <a:picLocks noChangeAspect="1" noChangeArrowheads="1"/>
+                    </pic:cNvPicPr>
+                  </pic:nvPicPr>
+                  <pic:blipFill>
+                    <a:blip r:embed="rId25" cstate="none"/>
+                    <a:srcRect/>
+                    <a:stretch>
+                      <a:fillRect/>
+                    </a:stretch>
+                  </pic:blipFill>
+                  <pic:spPr bwMode="auto">
+                    <a:xfrm>
+                      <a:off x="0" y="0"/>
+                      <a:ext cx="5715000" cy="3209925"/>
+                    </a:xfrm>
+                    <a:prstGeom prst="rect">
+                      <a:avLst/>
+                    </a:prstGeom>
+                  </pic:spPr>
+                </pic:pic>
+              </a:graphicData>
+            </a:graphic>
+          </wp:inline>
+        </w:drawing>
+      </w:r>
+    </w:p>
+    <w:p>
+      <w:pPr>
+        <w:spacing w:after="220"/>
+        <w:jc w:val="center"/>
+      </w:pPr>
+      <w:r>
+        <w:rPr>
+          <w:i/>
+          <w:iCs/>
+          <w:color w:val="555555"/>
+          <w:sz w:val="18"/>
+          <w:szCs w:val="18"/>
+        </w:rPr>
+        <w:t xml:space="preserve">Mensajes: los que todavía no leíste están resaltados y el menú muestra cuántos son.</w:t>
+      </w:r>
+    </w:p>
+    <w:p>
+      <w:pPr>
+        <w:spacing w:after="160"/>
+      </w:pPr>
+      <w:r>
+        <w:t xml:space="preserve">En el menú lateral, "Mensajes" muestra un número cuando tenés mensajes sin leer. Los no leídos están resaltados y marcados como "Nuevo". En cada mensaje podés:</w:t>
+      </w:r>
+    </w:p>
+    <w:p>
+      <w:pPr>
+        <w:pStyle w:val="ListParagraph"/>
+        <w:numPr>
+          <w:ilvl w:val="0"/>
+          <w:numId w:val="2"/>
+        </w:numPr>
+        <w:spacing w:after="80"/>
+      </w:pPr>
+      <w:r>
+        <w:t xml:space="preserve">"Marcar como leído": el mensaje deja de estar resaltado y baja el número del menú. Con "Marcar todos como leídos" lo hacés de una vez.</w:t>
+      </w:r>
+    </w:p>
+    <w:p>
+      <w:pPr>
+        <w:pStyle w:val="ListParagraph"/>
+        <w:numPr>
+          <w:ilvl w:val="0"/>
+          <w:numId w:val="2"/>
+        </w:numPr>
+        <w:spacing w:after="80"/>
+      </w:pPr>
+      <w:r>
+        <w:t xml:space="preserve">"Borrar": el mensaje desaparece de tu bandeja. Pedimos confirmación antes de borrar y no se puede deshacer.</w:t>
+      </w:r>
+    </w:p>
+    <w:p>
+      <w:pPr>
+        <w:spacing w:after="160"/>
+      </w:pPr>
+      <w:r>
+        <w:t xml:space="preserve">Si todavía no tenés mensajes, la pantalla lo dice y te lleva a Mis postulaciones. En el celular se ve igual, en una sola columna.</w:t>
+      </w:r>
+    </w:p>
+    <w:p>
+      <w:pPr>
+        <w:pBdr>
+          <w:top w:val="single" w:color="CCCCCC" w:sz="4"/>
+          <w:left w:val="single" w:color="CCCCCC" w:sz="4"/>
+          <w:bottom w:val="single" w:color="CCCCCC" w:sz="4"/>
+          <w:right w:val="single" w:color="CCCCCC" w:sz="4"/>
+        </w:pBdr>
+        <w:spacing w:after="80" w:before="120"/>
+        <w:jc w:val="center"/>
+      </w:pPr>
+      <w:r>
+        <w:drawing>
+          <wp:inline distT="0" distB="0" distL="0" distR="0">
+            <wp:extent cx="2190750" cy="4743450"/>
+            <wp:effectExtent t="0" r="0" b="0" l="0"/>
+            <wp:docPr id="20" name="" descr="" title=""/>
+            <wp:cNvGraphicFramePr>
+              <a:graphicFrameLocks xmlns:a="http://schemas.openxmlformats.org/drawingml/2006/main" noChangeAspect="1"/>
+            </wp:cNvGraphicFramePr>
+            <a:graphic xmlns:a="http://schemas.openxmlformats.org/drawingml/2006/main">
+              <a:graphicData uri="http://schemas.openxmlformats.org/drawingml/2006/picture">
+                <pic:pic xmlns:pic="http://schemas.openxmlformats.org/drawingml/2006/picture">
+                  <pic:nvPicPr>
+                    <pic:cNvPr id="0" name="" descr=""/>
+                    <pic:cNvPicPr>
+                      <a:picLocks noChangeAspect="1" noChangeArrowheads="1"/>
+                    </pic:cNvPicPr>
+                  </pic:nvPicPr>
+                  <pic:blipFill>
+                    <a:blip r:embed="rId26" cstate="none"/>
+                    <a:srcRect/>
+                    <a:stretch>
+                      <a:fillRect/>
+                    </a:stretch>
+                  </pic:blipFill>
+                  <pic:spPr bwMode="auto">
+                    <a:xfrm>
+                      <a:off x="0" y="0"/>
+                      <a:ext cx="2190750" cy="4743450"/>
+                    </a:xfrm>
+                    <a:prstGeom prst="rect">
+                      <a:avLst/>
+                    </a:prstGeom>
+                  </pic:spPr>
+                </pic:pic>
+              </a:graphicData>
+            </a:graphic>
+          </wp:inline>
+        </w:drawing>
+      </w:r>
+    </w:p>
+    <w:p>
+      <w:pPr>
+        <w:spacing w:after="220"/>
+        <w:jc w:val="center"/>
+      </w:pPr>
+      <w:r>
+        <w:rPr>
+          <w:i/>
+          <w:iCs/>
+          <w:color w:val="555555"/>
+          <w:sz w:val="18"/>
+          <w:szCs w:val="18"/>
+        </w:rPr>
+        <w:t xml:space="preserve">Mensajes en el celular.</w:t>
+      </w:r>
+    </w:p>
+    <w:p>
+      <w:pPr>
+        <w:pStyle w:val="Heading1"/>
+        <w:spacing w:after="200" w:before="400"/>
+      </w:pPr>
+      <w:r>
+        <w:t xml:space="preserve">10. Recordatorios por inactividad</w:t>
+      </w:r>
+    </w:p>
+    <w:p>
+      <w:pPr>
+        <w:spacing w:after="160"/>
+      </w:pPr>
+      <w:r>
+        <w:t xml:space="preserve">Cuando una postulación lleva varios días sin ninguna novedad, sin que hayas registrado una interacción ni cambiado su estado, Laburin te lo marca con un recordatorio, para que no se te pase hacer un seguimiento. Es solo un aviso: no se borra ni se cambia nada de la postulación.</w:t>
+      </w:r>
+    </w:p>
+    <w:p>
+      <w:pPr>
+        <w:spacing w:after="160"/>
+      </w:pPr>
+      <w:r>
+        <w:t xml:space="preserve">Vos elegís después de cuántos días se avisa: es el aviso de seguimiento que ajustás en Mi perfil de búsqueda (por defecto, 7 días; ver la sección 7). Si lo cambiás, el nuevo plazo se aplica de ahí en adelante y los avisos que ya tenías no se modifican.</w:t>
+      </w:r>
+    </w:p>
+    <w:p>
+      <w:pPr>
+        <w:spacing w:after="160"/>
+      </w:pPr>
+      <w:r>
+        <w:t xml:space="preserve">Vas a ver el recordatorio en Mis postulaciones, en la tarjeta de la postulación correspondiente ("Sin novedades hace N días", como se ve en la imagen de la sección 5), y también arriba de la ficha, con la aclaración de que es solo un recordatorio. Alcanza con registrar una interacción nueva, mover la tarjeta de estado o tocar "Marcar como resuelto" para que el recordatorio se resuelva.</w:t>
+      </w:r>
+    </w:p>
+    <w:p>
+      <w:pPr>
+        <w:pStyle w:val="Heading1"/>
+        <w:spacing w:after="200" w:before="400"/>
+      </w:pPr>
+      <w:r>
+        <w:t xml:space="preserve">11. Mi progreso</w:t>
+      </w:r>
+    </w:p>
+    <w:p>
+      <w:pPr>
+        <w:spacing w:after="160"/>
+      </w:pPr>
+      <w:r>
+        <w:t xml:space="preserve">La sección "Mi progreso" te muestra cómo viene tu búsqueda laboral: cuántas postulaciones tenés activas, cómo se reparten entre las etapas del proceso, cuál es tu puntaje promedio y qué fuentes te traen mejores ofertas. Te sirve para tomar una foto rápida sin tener que repasar oferta por oferta.</w:t>
+      </w:r>
+    </w:p>
+    <w:p>
+      <w:pPr>
+        <w:pBdr>
+          <w:top w:val="single" w:color="CCCCCC" w:sz="4"/>
+          <w:left w:val="single" w:color="CCCCCC" w:sz="4"/>
+          <w:bottom w:val="single" w:color="CCCCCC" w:sz="4"/>
+          <w:right w:val="single" w:color="CCCCCC" w:sz="4"/>
+        </w:pBdr>
+        <w:spacing w:after="80" w:before="120"/>
+        <w:jc w:val="center"/>
+      </w:pPr>
+      <w:r>
+        <w:drawing>
+          <wp:inline distT="0" distB="0" distL="0" distR="0">
+            <wp:extent cx="5715000" cy="3209925"/>
+            <wp:effectExtent t="0" r="0" b="0" l="0"/>
+            <wp:docPr id="21" name="" descr="" title=""/>
+            <wp:cNvGraphicFramePr>
+              <a:graphicFrameLocks xmlns:a="http://schemas.openxmlformats.org/drawingml/2006/main" noChangeAspect="1"/>
+            </wp:cNvGraphicFramePr>
+            <a:graphic xmlns:a="http://schemas.openxmlformats.org/drawingml/2006/main">
+              <a:graphicData uri="http://schemas.openxmlformats.org/drawingml/2006/picture">
+                <pic:pic xmlns:pic="http://schemas.openxmlformats.org/drawingml/2006/picture">
+                  <pic:nvPicPr>
+                    <pic:cNvPr id="0" name="" descr=""/>
+                    <pic:cNvPicPr>
+                      <a:picLocks noChangeAspect="1" noChangeArrowheads="1"/>
+                    </pic:cNvPicPr>
+                  </pic:nvPicPr>
+                  <pic:blipFill>
+                    <a:blip r:embed="rId27" cstate="none"/>
+                    <a:srcRect/>
+                    <a:stretch>
+                      <a:fillRect/>
+                    </a:stretch>
+                  </pic:blipFill>
+                  <pic:spPr bwMode="auto">
+                    <a:xfrm>
+                      <a:off x="0" y="0"/>
+                      <a:ext cx="5715000" cy="3209925"/>
+                    </a:xfrm>
+                    <a:prstGeom prst="rect">
+                      <a:avLst/>
+                    </a:prstGeom>
+                  </pic:spPr>
+                </pic:pic>
+              </a:graphicData>
+            </a:graphic>
+          </wp:inline>
+        </w:drawing>
+      </w:r>
+    </w:p>
+    <w:p>
+      <w:pPr>
+        <w:spacing w:after="220"/>
+        <w:jc w:val="center"/>
+      </w:pPr>
+      <w:r>
+        <w:rPr>
+          <w:i/>
+          <w:iCs/>
+          <w:color w:val="555555"/>
+          <w:sz w:val="18"/>
+          <w:szCs w:val="18"/>
+        </w:rPr>
+        <w:t xml:space="preserve">Mi progreso, con el resumen general de la búsqueda.</w:t>
+      </w:r>
+    </w:p>
+    <w:p>
+      <w:pPr>
+        <w:pStyle w:val="Heading1"/>
+        <w:spacing w:after="200" w:before="400"/>
+      </w:pPr>
+      <w:r>
+        <w:t xml:space="preserve">12. Tu privacidad</w:t>
+      </w:r>
+    </w:p>
+    <w:p>
+      <w:pPr>
+        <w:spacing w:after="160"/>
+      </w:pPr>
+      <w:r>
+        <w:t xml:space="preserve">Estos son los datos que puede ver el equipo de Laburin, y los que no:</w:t>
+      </w:r>
+    </w:p>
+    <w:p>
+      <w:pPr>
+        <w:pStyle w:val="ListParagraph"/>
+        <w:numPr>
+          <w:ilvl w:val="0"/>
+          <w:numId w:val="2"/>
+        </w:numPr>
+        <w:spacing w:after="80"/>
+      </w:pPr>
+      <w:r>
+        <w:t xml:space="preserve">Lo ve el equipo: tu nombre y tu perfil de búsqueda (rol, tecnologías, modalidad, ubicación y nivel de experiencia).</w:t>
+      </w:r>
+    </w:p>
+    <w:p>
+      <w:pPr>
+        <w:pStyle w:val="ListParagraph"/>
+        <w:numPr>
+          <w:ilvl w:val="0"/>
+          <w:numId w:val="2"/>
+        </w:numPr>
+        <w:spacing w:after="80"/>
+      </w:pPr>
+      <w:r>
+        <w:t xml:space="preserve">No lo ve nadie más que vos: tus ofertas, tus postulaciones, tus interacciones, tus recordatorios, tu historial y tu email.</w:t>
+      </w:r>
+    </w:p>
+    <w:p>
+      <w:pPr>
+        <w:spacing w:after="160"/>
+      </w:pPr>
+      <w:r>
+        <w:t xml:space="preserve">Verás este aviso en el primer paso de la configuración inicial, en el resumen final y en Mi cuenta: "Tu nombre y tu perfil de búsqueda (rol, tecnologías, modalidad, ubicación y nivel) los puede ver el equipo de Laburin. Tus ofertas y postulaciones son solo tuyas."</w:t>
+      </w:r>
+    </w:p>
+    <w:p>
+      <w:pPr>
+        <w:spacing w:after="160"/>
+      </w:pPr>
+      <w:r>
+        <w:t xml:space="preserve">Los mensajes que recibís son solo tuyos: nadie más los puede leer, y vos podés borrarlos cuando quieras.</w:t>
+      </w:r>
+    </w:p>
+    <w:p>
+      <w:pPr>
+        <w:pStyle w:val="Heading1"/>
+        <w:spacing w:after="200" w:before="400"/>
+      </w:pPr>
+      <w:r>
+        <w:t xml:space="preserve">13. Para el equipo de Laburin: Candidatos</w:t>
+      </w:r>
+    </w:p>
+    <w:p>
+      <w:pPr>
+        <w:spacing w:after="160"/>
+      </w:pPr>
+      <w:r>
+        <w:t xml:space="preserve">Esta sección es solo para quienes administran Laburin y no la ve ninguna otra persona. El rol de administrador no se puede pedir ni obtener desde la aplicación: lo asigna una persona del equipo directamente en la base de datos.</w:t>
+      </w:r>
+    </w:p>
+    <w:p>
+      <w:pPr>
+        <w:spacing w:after="160"/>
+      </w:pPr>
+      <w:r>
+        <w:t xml:space="preserve">Al iniciar sesión, el administrador entra directo a "Candidatos", y su menú solo tiene esa sección (más "Mi cuenta" y "Cerrar Sesión"). Una persona que no es administradora no puede entrar a esa pantalla, ni siquiera escribiendo la dirección a mano: la aplicación la devuelve a su inicio, y la base de datos tampoco le devolvería ningún dato.</w:t>
+      </w:r>
+    </w:p>
+    <w:p>
+      <w:pPr>
+        <w:pStyle w:val="Heading2"/>
+        <w:spacing w:after="140" w:before="280"/>
+      </w:pPr>
+      <w:r>
+        <w:t xml:space="preserve">Ver a los candidatos</w:t>
+      </w:r>
+    </w:p>
+    <w:p>
+      <w:pPr>
+        <w:spacing w:after="160"/>
+      </w:pPr>
+      <w:r>
+        <w:t xml:space="preserve">La pantalla lista a las personas que se registraron y completaron su perfil de búsqueda. Quienes omitieron la configuración inicial no aparecen, para no mostrar filas vacías. Cada tarjeta muestra el nombre, el rol que busca, la ubicación, la modalidad, el nivel, las tecnologías y la fecha de registro. El buscador filtra por nombre, rol, tecnología o ubicación, sin importar mayúsculas ni tildes.</w:t>
+      </w:r>
+    </w:p>
+    <w:p>
+      <w:pPr>
+        <w:pBdr>
+          <w:top w:val="single" w:color="CCCCCC" w:sz="4"/>
+          <w:left w:val="single" w:color="CCCCCC" w:sz="4"/>
+          <w:bottom w:val="single" w:color="CCCCCC" w:sz="4"/>
+          <w:right w:val="single" w:color="CCCCCC" w:sz="4"/>
+        </w:pBdr>
+        <w:spacing w:after="80" w:before="120"/>
+        <w:jc w:val="center"/>
+      </w:pPr>
+      <w:r>
+        <w:drawing>
+          <wp:inline distT="0" distB="0" distL="0" distR="0">
+            <wp:extent cx="5715000" cy="3209925"/>
+            <wp:effectExtent t="0" r="0" b="0" l="0"/>
+            <wp:docPr id="22" name="" descr="" title=""/>
+            <wp:cNvGraphicFramePr>
+              <a:graphicFrameLocks xmlns:a="http://schemas.openxmlformats.org/drawingml/2006/main" noChangeAspect="1"/>
+            </wp:cNvGraphicFramePr>
+            <a:graphic xmlns:a="http://schemas.openxmlformats.org/drawingml/2006/main">
+              <a:graphicData uri="http://schemas.openxmlformats.org/drawingml/2006/picture">
+                <pic:pic xmlns:pic="http://schemas.openxmlformats.org/drawingml/2006/picture">
+                  <pic:nvPicPr>
+                    <pic:cNvPr id="0" name="" descr=""/>
+                    <pic:cNvPicPr>
+                      <a:picLocks noChangeAspect="1" noChangeArrowheads="1"/>
+                    </pic:cNvPicPr>
+                  </pic:nvPicPr>
+                  <pic:blipFill>
+                    <a:blip r:embed="rId28" cstate="none"/>
+                    <a:srcRect/>
+                    <a:stretch>
+                      <a:fillRect/>
+                    </a:stretch>
+                  </pic:blipFill>
+                  <pic:spPr bwMode="auto">
+                    <a:xfrm>
+                      <a:off x="0" y="0"/>
+                      <a:ext cx="5715000" cy="3209925"/>
+                    </a:xfrm>
+                    <a:prstGeom prst="rect">
+                      <a:avLst/>
+                    </a:prstGeom>
+                  </pic:spPr>
+                </pic:pic>
+              </a:graphicData>
+            </a:graphic>
+          </wp:inline>
+        </w:drawing>
+      </w:r>
+    </w:p>
+    <w:p>
+      <w:pPr>
+        <w:spacing w:after="220"/>
+        <w:jc w:val="center"/>
+      </w:pPr>
+      <w:r>
+        <w:rPr>
+          <w:i/>
+          <w:iCs/>
+          <w:color w:val="555555"/>
+          <w:sz w:val="18"/>
+          <w:szCs w:val="18"/>
+        </w:rPr>
+        <w:t xml:space="preserve">Candidatos: listado con buscador (los nombres de la captura son ficticios).</w:t>
+      </w:r>
+    </w:p>
+    <w:p>
+      <w:pPr>
+        <w:pStyle w:val="Heading2"/>
+        <w:spacing w:after="140" w:before="280"/>
+      </w:pPr>
+      <w:r>
+        <w:t xml:space="preserve">Enviar un mensaje</w:t>
+      </w:r>
+    </w:p>
+    <w:p>
+      <w:pPr>
+        <w:spacing w:after="160"/>
+      </w:pPr>
+      <w:r>
+        <w:t xml:space="preserve">Al tocar una tarjeta se abre el detalle del candidato, con su perfil de búsqueda completo y el formulario "Enviar mensaje" (de 1 a 1000 caracteres; la pantalla avisa si el mensaje está vacío o es demasiado largo). Debajo, "Mensajes enviados" muestra el historial de lo que le escribiste a esa persona, con la indicación "Leído" o "Sin leer".</w:t>
+      </w:r>
+    </w:p>
+    <w:p>
+      <w:pPr>
+        <w:pBdr>
+          <w:top w:val="single" w:color="CCCCCC" w:sz="4"/>
+          <w:left w:val="single" w:color="CCCCCC" w:sz="4"/>
+          <w:bottom w:val="single" w:color="CCCCCC" w:sz="4"/>
+          <w:right w:val="single" w:color="CCCCCC" w:sz="4"/>
+        </w:pBdr>
+        <w:spacing w:after="80" w:before="120"/>
+        <w:jc w:val="center"/>
+      </w:pPr>
+      <w:r>
+        <w:drawing>
+          <wp:inline distT="0" distB="0" distL="0" distR="0">
+            <wp:extent cx="5715000" cy="4467225"/>
+            <wp:effectExtent t="0" r="0" b="0" l="0"/>
+            <wp:docPr id="23" name="" descr="" title=""/>
+            <wp:cNvGraphicFramePr>
+              <a:graphicFrameLocks xmlns:a="http://schemas.openxmlformats.org/drawingml/2006/main" noChangeAspect="1"/>
+            </wp:cNvGraphicFramePr>
+            <a:graphic xmlns:a="http://schemas.openxmlformats.org/drawingml/2006/main">
+              <a:graphicData uri="http://schemas.openxmlformats.org/drawingml/2006/picture">
+                <pic:pic xmlns:pic="http://schemas.openxmlformats.org/drawingml/2006/picture">
+                  <pic:nvPicPr>
+                    <pic:cNvPr id="0" name="" descr=""/>
+                    <pic:cNvPicPr>
+                      <a:picLocks noChangeAspect="1" noChangeArrowheads="1"/>
+                    </pic:cNvPicPr>
+                  </pic:nvPicPr>
+                  <pic:blipFill>
+                    <a:blip r:embed="rId29" cstate="none"/>
+                    <a:srcRect/>
+                    <a:stretch>
+                      <a:fillRect/>
+                    </a:stretch>
+                  </pic:blipFill>
+                  <pic:spPr bwMode="auto">
+                    <a:xfrm>
+                      <a:off x="0" y="0"/>
+                      <a:ext cx="5715000" cy="4467225"/>
+                    </a:xfrm>
+                    <a:prstGeom prst="rect">
+                      <a:avLst/>
+                    </a:prstGeom>
+                  </pic:spPr>
+                </pic:pic>
+              </a:graphicData>
+            </a:graphic>
+          </wp:inline>
+        </w:drawing>
+      </w:r>
+    </w:p>
+    <w:p>
+      <w:pPr>
+        <w:spacing w:after="220"/>
+        <w:jc w:val="center"/>
+      </w:pPr>
+      <w:r>
+        <w:rPr>
+          <w:i/>
+          <w:iCs/>
+          <w:color w:val="555555"/>
+          <w:sz w:val="18"/>
+          <w:szCs w:val="18"/>
+        </w:rPr>
+        <w:t xml:space="preserve">Detalle de un candidato: perfil de búsqueda y envío de un mensaje.</w:t>
+      </w:r>
+    </w:p>
+    <w:p>
+      <w:pPr>
+        <w:pStyle w:val="Heading2"/>
+        <w:spacing w:after="140" w:before="280"/>
+      </w:pPr>
+      <w:r>
+        <w:t xml:space="preserve">Qué no ve el administrador</w:t>
+      </w:r>
+    </w:p>
+    <w:p>
+      <w:pPr>
+        <w:spacing w:after="160"/>
+      </w:pPr>
+      <w:r>
+        <w:t xml:space="preserve">El administrador no ve las ofertas, postulaciones, interacciones, recordatorios ni criterios de los candidatos, ni su email, ni los mensajes que otros recibieron. Esto no depende de la pantalla: lo garantizan los permisos de la base de datos, y se verificó con pruebas de seguridad automáticas.</w:t>
       </w:r>
     </w:p>
     <w:sectPr>

</xml_diff>